<commit_message>
Updated SIP_Whitepaper.docx from latest content in SIP_Whitepaper.md
</commit_message>
<xml_diff>
--- a/Docs/SIP_Whitepaper.docx
+++ b/Docs/SIP_Whitepaper.docx
@@ -25,7 +25,7 @@
         <w:pStyle w:val="FirstParagraph"/>
       </w:pPr>
       <w:r>
-        <w:t xml:space="preserve">Version: Draft 0.8 - Matched Recognizable Examples Revision Date: May 22, 2026 Status: Conceptual Proposal</w:t>
+        <w:t xml:space="preserve">Version: Draft 0.9 - Semantic Path Search and Boolean Query Expressions Revision Date: May 26, 2026 Status: Conceptual Proposal</w:t>
       </w:r>
     </w:p>
     <w:bookmarkEnd w:id="9"/>
@@ -19416,6 +19416,1284 @@
     </w:p>
     <w:bookmarkEnd w:id="193"/>
     <w:bookmarkEnd w:id="194"/>
+    <w:bookmarkStart w:id="207" w:name="semantic-path-search"/>
+    <w:p>
+      <w:pPr>
+        <w:pStyle w:val="Heading1"/>
+      </w:pPr>
+      <w:r>
+        <w:t xml:space="preserve">Semantic Path Search</w:t>
+      </w:r>
+    </w:p>
+    <w:p>
+      <w:pPr>
+        <w:pStyle w:val="FirstParagraph"/>
+      </w:pPr>
+      <w:r>
+        <w:t xml:space="preserve">SIP-aware interfaces may support a global semantic path search feature that allows users to search across the entire registered SIP identity space using one or more keywords.</w:t>
+      </w:r>
+    </w:p>
+    <w:p>
+      <w:pPr>
+        <w:pStyle w:val="BodyText"/>
+      </w:pPr>
+      <w:r>
+        <w:t xml:space="preserve">Unlike Semantic IntelliSense, which guides users through the semantic hierarchy step by step, semantic path search allows users to query directly across all known SIP paths without knowing the starting category.</w:t>
+      </w:r>
+    </w:p>
+    <w:bookmarkStart w:id="195" w:name="search-based-navigation"/>
+    <w:p>
+      <w:pPr>
+        <w:pStyle w:val="Heading2"/>
+      </w:pPr>
+      <w:r>
+        <w:t xml:space="preserve">Search-Based Navigation</w:t>
+      </w:r>
+    </w:p>
+    <w:p>
+      <w:pPr>
+        <w:pStyle w:val="FirstParagraph"/>
+      </w:pPr>
+      <w:r>
+        <w:t xml:space="preserve">In addition to guided hierarchical IntelliSense, users may wish to navigate directly to a known or partially remembered SIP identity using keyword recall rather than step-by-step category traversal.</w:t>
+      </w:r>
+    </w:p>
+    <w:p>
+      <w:pPr>
+        <w:pStyle w:val="BodyText"/>
+      </w:pPr>
+      <w:r>
+        <w:t xml:space="preserve">Semantic path search allows users to type one or more keywords and immediately see a ranked list of matching SIP identities drawn from across:</w:t>
+      </w:r>
+    </w:p>
+    <w:p>
+      <w:pPr>
+        <w:pStyle w:val="Compact"/>
+        <w:numPr>
+          <w:ilvl w:val="0"/>
+          <w:numId w:val="1138"/>
+        </w:numPr>
+      </w:pPr>
+      <w:r>
+        <w:t xml:space="preserve">discovery paths in the semantic tree</w:t>
+      </w:r>
+    </w:p>
+    <w:p>
+      <w:pPr>
+        <w:pStyle w:val="Compact"/>
+        <w:numPr>
+          <w:ilvl w:val="0"/>
+          <w:numId w:val="1138"/>
+        </w:numPr>
+      </w:pPr>
+      <w:r>
+        <w:t xml:space="preserve">owner-bound canonical identities</w:t>
+      </w:r>
+    </w:p>
+    <w:p>
+      <w:pPr>
+        <w:pStyle w:val="Compact"/>
+        <w:numPr>
+          <w:ilvl w:val="0"/>
+          <w:numId w:val="1138"/>
+        </w:numPr>
+      </w:pPr>
+      <w:r>
+        <w:t xml:space="preserve">shortcut aliases and expansions</w:t>
+      </w:r>
+    </w:p>
+    <w:p>
+      <w:pPr>
+        <w:pStyle w:val="Compact"/>
+        <w:numPr>
+          <w:ilvl w:val="0"/>
+          <w:numId w:val="1138"/>
+        </w:numPr>
+      </w:pPr>
+      <w:r>
+        <w:t xml:space="preserve">personal shortcut bindings (within the user’s trusted context)</w:t>
+      </w:r>
+    </w:p>
+    <w:p>
+      <w:pPr>
+        <w:pStyle w:val="FirstParagraph"/>
+      </w:pPr>
+      <w:r>
+        <w:t xml:space="preserve">Example:</w:t>
+      </w:r>
+    </w:p>
+    <w:p>
+      <w:pPr>
+        <w:pStyle w:val="BodyText"/>
+      </w:pPr>
+      <w:r>
+        <w:t xml:space="preserve">User types:</w:t>
+      </w:r>
+    </w:p>
+    <w:p>
+      <w:pPr>
+        <w:pStyle w:val="BodyText"/>
+      </w:pPr>
+      <w:r>
+        <w:t xml:space="preserve">lasca</w:t>
+      </w:r>
+    </w:p>
+    <w:p>
+      <w:pPr>
+        <w:pStyle w:val="BodyText"/>
+      </w:pPr>
+      <w:r>
+        <w:t xml:space="preserve">Matching results may include:</w:t>
+      </w:r>
+    </w:p>
+    <w:p>
+      <w:pPr>
+        <w:pStyle w:val="BodyText"/>
+      </w:pPr>
+      <w:r>
+        <w:t xml:space="preserve">@games.strategy.abstract.capture.leaping.columns.lasca</w:t>
+      </w:r>
+      <w:r>
+        <w:t xml:space="preserve"> </w:t>
+      </w:r>
+      <w:r>
+        <w:t xml:space="preserve">(discovery)</w:t>
+      </w:r>
+      <w:r>
+        <w:br/>
+      </w:r>
+      <w:r>
+        <w:t xml:space="preserve">@stackworks.games.strategy.abstract.capture.leaping.columns.lasca</w:t>
+      </w:r>
+      <w:r>
+        <w:t xml:space="preserve"> </w:t>
+      </w:r>
+      <w:r>
+        <w:t xml:space="preserve">(owner-bound)</w:t>
+      </w:r>
+      <w:r>
+        <w:br/>
+      </w:r>
+      <w:r>
+        <w:t xml:space="preserve">@stackworks.games.lasca</w:t>
+      </w:r>
+      <w:r>
+        <w:t xml:space="preserve"> </w:t>
+      </w:r>
+      <w:r>
+        <w:t xml:space="preserve">(shortcut)</w:t>
+      </w:r>
+    </w:p>
+    <w:p>
+      <w:pPr>
+        <w:pStyle w:val="BodyText"/>
+      </w:pPr>
+      <w:r>
+        <w:t xml:space="preserve">The user may select any matching result to load it immediately as the active SIP expression.</w:t>
+      </w:r>
+    </w:p>
+    <w:bookmarkEnd w:id="195"/>
+    <w:bookmarkStart w:id="200" w:name="boolean-keyword-expressions"/>
+    <w:p>
+      <w:pPr>
+        <w:pStyle w:val="Heading2"/>
+      </w:pPr>
+      <w:r>
+        <w:t xml:space="preserve">Boolean Keyword Expressions</w:t>
+      </w:r>
+    </w:p>
+    <w:p>
+      <w:pPr>
+        <w:pStyle w:val="FirstParagraph"/>
+      </w:pPr>
+      <w:r>
+        <w:t xml:space="preserve">Semantic path search should support boolean keyword expressions to allow precise multi-keyword filtering across large semantic identity spaces.</w:t>
+      </w:r>
+    </w:p>
+    <w:p>
+      <w:pPr>
+        <w:pStyle w:val="BodyText"/>
+      </w:pPr>
+      <w:r>
+        <w:t xml:space="preserve">The query language is intentionally simple and familiar, using operators that do not conflict with SIP path syntax.</w:t>
+      </w:r>
+    </w:p>
+    <w:bookmarkStart w:id="196" w:name="or-expressions"/>
+    <w:p>
+      <w:pPr>
+        <w:pStyle w:val="Heading3"/>
+      </w:pPr>
+      <w:r>
+        <w:t xml:space="preserve">OR Expressions</w:t>
+      </w:r>
+    </w:p>
+    <w:p>
+      <w:pPr>
+        <w:pStyle w:val="FirstParagraph"/>
+      </w:pPr>
+      <w:r>
+        <w:t xml:space="preserve">Multiple keywords separated by spaces, commas, or the</w:t>
+      </w:r>
+      <w:r>
+        <w:t xml:space="preserve"> </w:t>
+      </w:r>
+      <w:r>
+        <w:rPr>
+          <w:rStyle w:val="VerbatimChar"/>
+        </w:rPr>
+        <w:t xml:space="preserve">|</w:t>
+      </w:r>
+      <w:r>
+        <w:t xml:space="preserve"> </w:t>
+      </w:r>
+      <w:r>
+        <w:t xml:space="preserve">pipe operator return results matching any one of the keywords.</w:t>
+      </w:r>
+    </w:p>
+    <w:p>
+      <w:pPr>
+        <w:pStyle w:val="BodyText"/>
+      </w:pPr>
+      <w:r>
+        <w:t xml:space="preserve">The following expressions are equivalent:</w:t>
+      </w:r>
+    </w:p>
+    <w:p>
+      <w:pPr>
+        <w:pStyle w:val="SourceCode"/>
+      </w:pPr>
+      <w:r>
+        <w:rPr>
+          <w:rStyle w:val="VerbatimChar"/>
+        </w:rPr>
+        <w:t xml:space="preserve">chess | checkers</w:t>
+      </w:r>
+      <w:r>
+        <w:br/>
+      </w:r>
+      <w:r>
+        <w:rPr>
+          <w:rStyle w:val="VerbatimChar"/>
+        </w:rPr>
+        <w:t xml:space="preserve">chess, checkers</w:t>
+      </w:r>
+      <w:r>
+        <w:br/>
+      </w:r>
+      <w:r>
+        <w:rPr>
+          <w:rStyle w:val="VerbatimChar"/>
+        </w:rPr>
+        <w:t xml:space="preserve">chess checkers</w:t>
+      </w:r>
+    </w:p>
+    <w:p>
+      <w:pPr>
+        <w:pStyle w:val="FirstParagraph"/>
+      </w:pPr>
+      <w:r>
+        <w:t xml:space="preserve">All three return SIP identities whose path or label contains either chess or checkers.</w:t>
+      </w:r>
+    </w:p>
+    <w:bookmarkEnd w:id="196"/>
+    <w:bookmarkStart w:id="197" w:name="and-expressions"/>
+    <w:p>
+      <w:pPr>
+        <w:pStyle w:val="Heading3"/>
+      </w:pPr>
+      <w:r>
+        <w:t xml:space="preserve">AND Expressions</w:t>
+      </w:r>
+    </w:p>
+    <w:p>
+      <w:pPr>
+        <w:pStyle w:val="FirstParagraph"/>
+      </w:pPr>
+      <w:r>
+        <w:t xml:space="preserve">Multiple keywords joined by</w:t>
+      </w:r>
+      <w:r>
+        <w:t xml:space="preserve"> </w:t>
+      </w:r>
+      <w:r>
+        <w:rPr>
+          <w:rStyle w:val="VerbatimChar"/>
+        </w:rPr>
+        <w:t xml:space="preserve">&amp;</w:t>
+      </w:r>
+      <w:r>
+        <w:t xml:space="preserve"> </w:t>
+      </w:r>
+      <w:r>
+        <w:t xml:space="preserve">or</w:t>
+      </w:r>
+      <w:r>
+        <w:t xml:space="preserve"> </w:t>
+      </w:r>
+      <w:r>
+        <w:rPr>
+          <w:rStyle w:val="VerbatimChar"/>
+        </w:rPr>
+        <w:t xml:space="preserve">+</w:t>
+      </w:r>
+      <w:r>
+        <w:t xml:space="preserve"> </w:t>
+      </w:r>
+      <w:r>
+        <w:t xml:space="preserve">return only results matching all specified keywords.</w:t>
+      </w:r>
+    </w:p>
+    <w:p>
+      <w:pPr>
+        <w:pStyle w:val="BodyText"/>
+      </w:pPr>
+      <w:r>
+        <w:t xml:space="preserve">The following expressions are equivalent:</w:t>
+      </w:r>
+    </w:p>
+    <w:p>
+      <w:pPr>
+        <w:pStyle w:val="SourceCode"/>
+      </w:pPr>
+      <w:r>
+        <w:rPr>
+          <w:rStyle w:val="VerbatimChar"/>
+        </w:rPr>
+        <w:t xml:space="preserve">chess &amp; columns</w:t>
+      </w:r>
+      <w:r>
+        <w:br/>
+      </w:r>
+      <w:r>
+        <w:rPr>
+          <w:rStyle w:val="VerbatimChar"/>
+        </w:rPr>
+        <w:t xml:space="preserve">chess + columns</w:t>
+      </w:r>
+    </w:p>
+    <w:p>
+      <w:pPr>
+        <w:pStyle w:val="FirstParagraph"/>
+      </w:pPr>
+      <w:r>
+        <w:t xml:space="preserve">Both return only SIP identities containing both chess and columns.</w:t>
+      </w:r>
+    </w:p>
+    <w:bookmarkEnd w:id="197"/>
+    <w:bookmarkStart w:id="198" w:name="grouped-expressions"/>
+    <w:p>
+      <w:pPr>
+        <w:pStyle w:val="Heading3"/>
+      </w:pPr>
+      <w:r>
+        <w:t xml:space="preserve">Grouped Expressions</w:t>
+      </w:r>
+    </w:p>
+    <w:p>
+      <w:pPr>
+        <w:pStyle w:val="FirstParagraph"/>
+      </w:pPr>
+      <w:r>
+        <w:t xml:space="preserve">Parentheses allow combining OR and AND logic within the same query.</w:t>
+      </w:r>
+    </w:p>
+    <w:p>
+      <w:pPr>
+        <w:pStyle w:val="BodyText"/>
+      </w:pPr>
+      <w:r>
+        <w:t xml:space="preserve">Example:</w:t>
+      </w:r>
+    </w:p>
+    <w:p>
+      <w:pPr>
+        <w:pStyle w:val="SourceCode"/>
+      </w:pPr>
+      <w:r>
+        <w:rPr>
+          <w:rStyle w:val="VerbatimChar"/>
+        </w:rPr>
+        <w:t xml:space="preserve">(chess | checkers) &amp; columns</w:t>
+      </w:r>
+      <w:r>
+        <w:br/>
+      </w:r>
+      <w:r>
+        <w:rPr>
+          <w:rStyle w:val="VerbatimChar"/>
+        </w:rPr>
+        <w:t xml:space="preserve">(chess | checkers) + columns</w:t>
+      </w:r>
+    </w:p>
+    <w:p>
+      <w:pPr>
+        <w:pStyle w:val="FirstParagraph"/>
+      </w:pPr>
+      <w:r>
+        <w:t xml:space="preserve">Both expressions return SIP identities that contain columns and at least one of chess or checkers.</w:t>
+      </w:r>
+    </w:p>
+    <w:bookmarkEnd w:id="198"/>
+    <w:bookmarkStart w:id="199" w:name="operator-precedence"/>
+    <w:p>
+      <w:pPr>
+        <w:pStyle w:val="Heading3"/>
+      </w:pPr>
+      <w:r>
+        <w:t xml:space="preserve">Operator Precedence</w:t>
+      </w:r>
+    </w:p>
+    <w:p>
+      <w:pPr>
+        <w:pStyle w:val="FirstParagraph"/>
+      </w:pPr>
+      <w:r>
+        <w:t xml:space="preserve">AND (</w:t>
+      </w:r>
+      <w:r>
+        <w:rPr>
+          <w:rStyle w:val="VerbatimChar"/>
+        </w:rPr>
+        <w:t xml:space="preserve">&amp;</w:t>
+      </w:r>
+      <w:r>
+        <w:t xml:space="preserve">,</w:t>
+      </w:r>
+      <w:r>
+        <w:t xml:space="preserve"> </w:t>
+      </w:r>
+      <w:r>
+        <w:rPr>
+          <w:rStyle w:val="VerbatimChar"/>
+        </w:rPr>
+        <w:t xml:space="preserve">+</w:t>
+      </w:r>
+      <w:r>
+        <w:t xml:space="preserve">) binds more tightly than OR (</w:t>
+      </w:r>
+      <w:r>
+        <w:rPr>
+          <w:rStyle w:val="VerbatimChar"/>
+        </w:rPr>
+        <w:t xml:space="preserve">|</w:t>
+      </w:r>
+      <w:r>
+        <w:t xml:space="preserve">,</w:t>
+      </w:r>
+      <w:r>
+        <w:t xml:space="preserve"> </w:t>
+      </w:r>
+      <w:r>
+        <w:rPr>
+          <w:rStyle w:val="VerbatimChar"/>
+        </w:rPr>
+        <w:t xml:space="preserve">,</w:t>
+      </w:r>
+      <w:r>
+        <w:t xml:space="preserve">, space), following standard boolean algebra precedence.</w:t>
+      </w:r>
+    </w:p>
+    <w:p>
+      <w:pPr>
+        <w:pStyle w:val="BodyText"/>
+      </w:pPr>
+      <w:r>
+        <w:t xml:space="preserve">Example:</w:t>
+      </w:r>
+    </w:p>
+    <w:p>
+      <w:pPr>
+        <w:pStyle w:val="SourceCode"/>
+      </w:pPr>
+      <w:r>
+        <w:rPr>
+          <w:rStyle w:val="VerbatimChar"/>
+        </w:rPr>
+        <w:t xml:space="preserve">chess | checkers &amp; columns</w:t>
+      </w:r>
+    </w:p>
+    <w:p>
+      <w:pPr>
+        <w:pStyle w:val="FirstParagraph"/>
+      </w:pPr>
+      <w:r>
+        <w:t xml:space="preserve">is interpreted as:</w:t>
+      </w:r>
+    </w:p>
+    <w:p>
+      <w:pPr>
+        <w:pStyle w:val="SourceCode"/>
+      </w:pPr>
+      <w:r>
+        <w:rPr>
+          <w:rStyle w:val="VerbatimChar"/>
+        </w:rPr>
+        <w:t xml:space="preserve">chess | (checkers &amp; columns)</w:t>
+      </w:r>
+    </w:p>
+    <w:p>
+      <w:pPr>
+        <w:pStyle w:val="FirstParagraph"/>
+      </w:pPr>
+      <w:r>
+        <w:t xml:space="preserve">Parentheses may be used to override default precedence explicitly.</w:t>
+      </w:r>
+    </w:p>
+    <w:bookmarkEnd w:id="199"/>
+    <w:bookmarkEnd w:id="200"/>
+    <w:bookmarkStart w:id="201" w:name="synonym-aware-matching"/>
+    <w:p>
+      <w:pPr>
+        <w:pStyle w:val="Heading2"/>
+      </w:pPr>
+      <w:r>
+        <w:t xml:space="preserve">Synonym-Aware Matching</w:t>
+      </w:r>
+    </w:p>
+    <w:p>
+      <w:pPr>
+        <w:pStyle w:val="FirstParagraph"/>
+      </w:pPr>
+      <w:r>
+        <w:t xml:space="preserve">Semantic path search automatically expands query terms to their registered synonyms before matching.</w:t>
+      </w:r>
+    </w:p>
+    <w:p>
+      <w:pPr>
+        <w:pStyle w:val="BodyText"/>
+      </w:pPr>
+      <w:r>
+        <w:t xml:space="preserve">If a keyword in the search query is a known synonym for a segment that appears in a SIP string, that SIP string will be returned as a match even though the literal keyword does not appear in it.</w:t>
+      </w:r>
+    </w:p>
+    <w:p>
+      <w:pPr>
+        <w:pStyle w:val="BodyText"/>
+      </w:pPr>
+      <w:r>
+        <w:t xml:space="preserve">Example:</w:t>
+      </w:r>
+    </w:p>
+    <w:p>
+      <w:pPr>
+        <w:pStyle w:val="BodyText"/>
+      </w:pPr>
+      <w:r>
+        <w:t xml:space="preserve">The segment</w:t>
+      </w:r>
+      <w:r>
+        <w:t xml:space="preserve"> </w:t>
+      </w:r>
+      <w:r>
+        <w:rPr>
+          <w:rStyle w:val="VerbatimChar"/>
+        </w:rPr>
+        <w:t xml:space="preserve">stacks</w:t>
+      </w:r>
+      <w:r>
+        <w:t xml:space="preserve"> </w:t>
+      </w:r>
+      <w:r>
+        <w:t xml:space="preserve">is registered as a synonym for</w:t>
+      </w:r>
+      <w:r>
+        <w:t xml:space="preserve"> </w:t>
+      </w:r>
+      <w:r>
+        <w:rPr>
+          <w:rStyle w:val="VerbatimChar"/>
+        </w:rPr>
+        <w:t xml:space="preserve">columns</w:t>
+      </w:r>
+      <w:r>
+        <w:t xml:space="preserve"> </w:t>
+      </w:r>
+      <w:r>
+        <w:t xml:space="preserve">within the displacement capture context.</w:t>
+      </w:r>
+    </w:p>
+    <w:p>
+      <w:pPr>
+        <w:pStyle w:val="BodyText"/>
+      </w:pPr>
+      <w:r>
+        <w:t xml:space="preserve">A search for:</w:t>
+      </w:r>
+    </w:p>
+    <w:p>
+      <w:pPr>
+        <w:pStyle w:val="SourceCode"/>
+      </w:pPr>
+      <w:r>
+        <w:rPr>
+          <w:rStyle w:val="VerbatimChar"/>
+        </w:rPr>
+        <w:t xml:space="preserve">chess + stacks</w:t>
+      </w:r>
+    </w:p>
+    <w:p>
+      <w:pPr>
+        <w:pStyle w:val="FirstParagraph"/>
+      </w:pPr>
+      <w:r>
+        <w:t xml:space="preserve">will therefore match:</w:t>
+      </w:r>
+    </w:p>
+    <w:p>
+      <w:pPr>
+        <w:pStyle w:val="SourceCode"/>
+      </w:pPr>
+      <w:r>
+        <w:rPr>
+          <w:rStyle w:val="VerbatimChar"/>
+        </w:rPr>
+        <w:t xml:space="preserve">@games.strategy.abstract.capture.displacement.columns.chess</w:t>
+      </w:r>
+    </w:p>
+    <w:p>
+      <w:pPr>
+        <w:pStyle w:val="FirstParagraph"/>
+      </w:pPr>
+      <w:r>
+        <w:t xml:space="preserve">because</w:t>
+      </w:r>
+      <w:r>
+        <w:t xml:space="preserve"> </w:t>
+      </w:r>
+      <w:r>
+        <w:rPr>
+          <w:rStyle w:val="VerbatimChar"/>
+        </w:rPr>
+        <w:t xml:space="preserve">stacks</w:t>
+      </w:r>
+      <w:r>
+        <w:t xml:space="preserve"> </w:t>
+      </w:r>
+      <w:r>
+        <w:t xml:space="preserve">expands to its synonym</w:t>
+      </w:r>
+      <w:r>
+        <w:t xml:space="preserve"> </w:t>
+      </w:r>
+      <w:r>
+        <w:rPr>
+          <w:rStyle w:val="VerbatimChar"/>
+        </w:rPr>
+        <w:t xml:space="preserve">columns</w:t>
+      </w:r>
+      <w:r>
+        <w:t xml:space="preserve">, and</w:t>
+      </w:r>
+      <w:r>
+        <w:t xml:space="preserve"> </w:t>
+      </w:r>
+      <w:r>
+        <w:rPr>
+          <w:rStyle w:val="VerbatimChar"/>
+        </w:rPr>
+        <w:t xml:space="preserve">columns</w:t>
+      </w:r>
+      <w:r>
+        <w:t xml:space="preserve"> </w:t>
+      </w:r>
+      <w:r>
+        <w:t xml:space="preserve">is present in the SIP path.</w:t>
+      </w:r>
+    </w:p>
+    <w:p>
+      <w:pPr>
+        <w:pStyle w:val="BodyText"/>
+      </w:pPr>
+      <w:r>
+        <w:t xml:space="preserve">Synonym expansion applies per query term. Each term in a boolean expression is independently expanded before the full expression is evaluated against the candidate SIP string.</w:t>
+      </w:r>
+    </w:p>
+    <w:p>
+      <w:pPr>
+        <w:pStyle w:val="BodyText"/>
+      </w:pPr>
+      <w:r>
+        <w:t xml:space="preserve">Synonyms are context-defined. A synonym relationship established within one semantic branch does not automatically apply to unrelated branches where the same word carries a different meaning.</w:t>
+      </w:r>
+    </w:p>
+    <w:p>
+      <w:pPr>
+        <w:pStyle w:val="BodyText"/>
+      </w:pPr>
+      <w:r>
+        <w:t xml:space="preserve">This allows search to behave naturally with the semantic vocabulary users already know, without requiring them to memorize which segment wording is canonical in a given part of the SIP hierarchy.</w:t>
+      </w:r>
+    </w:p>
+    <w:bookmarkEnd w:id="201"/>
+    <w:bookmarkStart w:id="202" w:name="search-scope"/>
+    <w:p>
+      <w:pPr>
+        <w:pStyle w:val="Heading2"/>
+      </w:pPr>
+      <w:r>
+        <w:t xml:space="preserve">Search Scope</w:t>
+      </w:r>
+    </w:p>
+    <w:p>
+      <w:pPr>
+        <w:pStyle w:val="FirstParagraph"/>
+      </w:pPr>
+      <w:r>
+        <w:t xml:space="preserve">Semantic path search may be applied across:</w:t>
+      </w:r>
+    </w:p>
+    <w:p>
+      <w:pPr>
+        <w:pStyle w:val="Compact"/>
+        <w:numPr>
+          <w:ilvl w:val="0"/>
+          <w:numId w:val="1139"/>
+        </w:numPr>
+      </w:pPr>
+      <w:r>
+        <w:rPr>
+          <w:b/>
+          <w:bCs/>
+        </w:rPr>
+        <w:t xml:space="preserve">Discovery paths</w:t>
+      </w:r>
+      <w:r>
+        <w:t xml:space="preserve"> </w:t>
+      </w:r>
+      <w:r>
+        <w:t xml:space="preserve">— all registered semantic path segments in the SIP discovery tree, including intermediate nodes and leaf nodes</w:t>
+      </w:r>
+    </w:p>
+    <w:p>
+      <w:pPr>
+        <w:pStyle w:val="Compact"/>
+        <w:numPr>
+          <w:ilvl w:val="0"/>
+          <w:numId w:val="1139"/>
+        </w:numPr>
+      </w:pPr>
+      <w:r>
+        <w:rPr>
+          <w:b/>
+          <w:bCs/>
+        </w:rPr>
+        <w:t xml:space="preserve">Owner-bound identities</w:t>
+      </w:r>
+      <w:r>
+        <w:t xml:space="preserve"> </w:t>
+      </w:r>
+      <w:r>
+        <w:t xml:space="preserve">— canonical owner-qualified SIP strings published by verified owners</w:t>
+      </w:r>
+    </w:p>
+    <w:p>
+      <w:pPr>
+        <w:pStyle w:val="Compact"/>
+        <w:numPr>
+          <w:ilvl w:val="0"/>
+          <w:numId w:val="1139"/>
+        </w:numPr>
+      </w:pPr>
+      <w:r>
+        <w:rPr>
+          <w:b/>
+          <w:bCs/>
+        </w:rPr>
+        <w:t xml:space="preserve">Shortcut aliases</w:t>
+      </w:r>
+      <w:r>
+        <w:t xml:space="preserve"> </w:t>
+      </w:r>
+      <w:r>
+        <w:t xml:space="preserve">— compact semantic shortcut expressions and their expansion targets</w:t>
+      </w:r>
+    </w:p>
+    <w:p>
+      <w:pPr>
+        <w:pStyle w:val="Compact"/>
+        <w:numPr>
+          <w:ilvl w:val="0"/>
+          <w:numId w:val="1139"/>
+        </w:numPr>
+      </w:pPr>
+      <w:r>
+        <w:rPr>
+          <w:b/>
+          <w:bCs/>
+        </w:rPr>
+        <w:t xml:space="preserve">Personal shortcuts</w:t>
+      </w:r>
+      <w:r>
+        <w:t xml:space="preserve"> </w:t>
+      </w:r>
+      <w:r>
+        <w:t xml:space="preserve">— user-saved shortcut bindings, included only within the user’s trusted resolver context</w:t>
+      </w:r>
+    </w:p>
+    <w:p>
+      <w:pPr>
+        <w:pStyle w:val="FirstParagraph"/>
+      </w:pPr>
+      <w:r>
+        <w:t xml:space="preserve">Search matching may be applied to both the SIP path string and any associated human-readable label or description.</w:t>
+      </w:r>
+    </w:p>
+    <w:bookmarkEnd w:id="202"/>
+    <w:bookmarkStart w:id="203" w:name="selecting-search-results"/>
+    <w:p>
+      <w:pPr>
+        <w:pStyle w:val="Heading2"/>
+      </w:pPr>
+      <w:r>
+        <w:t xml:space="preserve">Selecting Search Results</w:t>
+      </w:r>
+    </w:p>
+    <w:p>
+      <w:pPr>
+        <w:pStyle w:val="FirstParagraph"/>
+      </w:pPr>
+      <w:r>
+        <w:t xml:space="preserve">When a user selects a result from the search panel, the selected SIP string becomes the active expression in the semantic input field.</w:t>
+      </w:r>
+    </w:p>
+    <w:p>
+      <w:pPr>
+        <w:pStyle w:val="BodyText"/>
+      </w:pPr>
+      <w:r>
+        <w:t xml:space="preserve">The interface then transitions to normal guided navigation mode with the selected SIP as the starting point.</w:t>
+      </w:r>
+    </w:p>
+    <w:p>
+      <w:pPr>
+        <w:pStyle w:val="BodyText"/>
+      </w:pPr>
+      <w:r>
+        <w:t xml:space="preserve">This allows users to combine keyword-driven initial discovery with guided IntelliSense-based refinement.</w:t>
+      </w:r>
+    </w:p>
+    <w:p>
+      <w:pPr>
+        <w:pStyle w:val="BodyText"/>
+      </w:pPr>
+      <w:r>
+        <w:t xml:space="preserve">For example:</w:t>
+      </w:r>
+    </w:p>
+    <w:p>
+      <w:pPr>
+        <w:pStyle w:val="Compact"/>
+        <w:numPr>
+          <w:ilvl w:val="0"/>
+          <w:numId w:val="1140"/>
+        </w:numPr>
+      </w:pPr>
+      <w:r>
+        <w:t xml:space="preserve">User searches for: lasca</w:t>
+      </w:r>
+    </w:p>
+    <w:p>
+      <w:pPr>
+        <w:pStyle w:val="Compact"/>
+        <w:numPr>
+          <w:ilvl w:val="0"/>
+          <w:numId w:val="1140"/>
+        </w:numPr>
+      </w:pPr>
+      <w:r>
+        <w:t xml:space="preserve">User selects:</w:t>
+      </w:r>
+      <w:r>
+        <w:t xml:space="preserve"> </w:t>
+      </w:r>
+      <w:r>
+        <w:t xml:space="preserve">@games.strategy.abstract.capture.leaping.columns.lasca</w:t>
+      </w:r>
+    </w:p>
+    <w:p>
+      <w:pPr>
+        <w:pStyle w:val="Compact"/>
+        <w:numPr>
+          <w:ilvl w:val="0"/>
+          <w:numId w:val="1140"/>
+        </w:numPr>
+      </w:pPr>
+      <w:r>
+        <w:t xml:space="preserve">Active SIP field is populated with the selected path</w:t>
+      </w:r>
+    </w:p>
+    <w:p>
+      <w:pPr>
+        <w:pStyle w:val="Compact"/>
+        <w:numPr>
+          <w:ilvl w:val="0"/>
+          <w:numId w:val="1140"/>
+        </w:numPr>
+      </w:pPr>
+      <w:r>
+        <w:t xml:space="preserve">Semantic IntelliSense may then offer continuations or owner-bound candidates from that point</w:t>
+      </w:r>
+    </w:p>
+    <w:bookmarkEnd w:id="203"/>
+    <w:bookmarkStart w:id="204" w:name="relationship-to-semantic-intellisense"/>
+    <w:p>
+      <w:pPr>
+        <w:pStyle w:val="Heading2"/>
+      </w:pPr>
+      <w:r>
+        <w:t xml:space="preserve">Relationship to Semantic IntelliSense</w:t>
+      </w:r>
+    </w:p>
+    <w:p>
+      <w:pPr>
+        <w:pStyle w:val="FirstParagraph"/>
+      </w:pPr>
+      <w:r>
+        <w:t xml:space="preserve">Semantic path search and Semantic IntelliSense serve complementary navigation purposes.</w:t>
+      </w:r>
+    </w:p>
+    <w:p>
+      <w:pPr>
+        <w:pStyle w:val="BodyText"/>
+      </w:pPr>
+      <w:r>
+        <w:t xml:space="preserve">Semantic IntelliSense is optimized for:</w:t>
+      </w:r>
+    </w:p>
+    <w:p>
+      <w:pPr>
+        <w:pStyle w:val="Compact"/>
+        <w:numPr>
+          <w:ilvl w:val="0"/>
+          <w:numId w:val="1141"/>
+        </w:numPr>
+      </w:pPr>
+      <w:r>
+        <w:t xml:space="preserve">step-by-step semantic exploration</w:t>
+      </w:r>
+    </w:p>
+    <w:p>
+      <w:pPr>
+        <w:pStyle w:val="Compact"/>
+        <w:numPr>
+          <w:ilvl w:val="0"/>
+          <w:numId w:val="1141"/>
+        </w:numPr>
+      </w:pPr>
+      <w:r>
+        <w:t xml:space="preserve">guided hierarchical navigation</w:t>
+      </w:r>
+    </w:p>
+    <w:p>
+      <w:pPr>
+        <w:pStyle w:val="Compact"/>
+        <w:numPr>
+          <w:ilvl w:val="0"/>
+          <w:numId w:val="1141"/>
+        </w:numPr>
+      </w:pPr>
+      <w:r>
+        <w:t xml:space="preserve">discovering semantic structure progressively</w:t>
+      </w:r>
+    </w:p>
+    <w:p>
+      <w:pPr>
+        <w:pStyle w:val="Compact"/>
+        <w:numPr>
+          <w:ilvl w:val="0"/>
+          <w:numId w:val="1141"/>
+        </w:numPr>
+      </w:pPr>
+      <w:r>
+        <w:t xml:space="preserve">navigating from a known starting category</w:t>
+      </w:r>
+    </w:p>
+    <w:p>
+      <w:pPr>
+        <w:pStyle w:val="FirstParagraph"/>
+      </w:pPr>
+      <w:r>
+        <w:t xml:space="preserve">Semantic path search is optimized for:</w:t>
+      </w:r>
+    </w:p>
+    <w:p>
+      <w:pPr>
+        <w:pStyle w:val="Compact"/>
+        <w:numPr>
+          <w:ilvl w:val="0"/>
+          <w:numId w:val="1142"/>
+        </w:numPr>
+      </w:pPr>
+      <w:r>
+        <w:t xml:space="preserve">finding a known or partially remembered SIP path by keyword</w:t>
+      </w:r>
+    </w:p>
+    <w:p>
+      <w:pPr>
+        <w:pStyle w:val="Compact"/>
+        <w:numPr>
+          <w:ilvl w:val="0"/>
+          <w:numId w:val="1142"/>
+        </w:numPr>
+      </w:pPr>
+      <w:r>
+        <w:t xml:space="preserve">querying across the entire semantic corpus at once</w:t>
+      </w:r>
+    </w:p>
+    <w:p>
+      <w:pPr>
+        <w:pStyle w:val="Compact"/>
+        <w:numPr>
+          <w:ilvl w:val="0"/>
+          <w:numId w:val="1142"/>
+        </w:numPr>
+      </w:pPr>
+      <w:r>
+        <w:t xml:space="preserve">combining multiple keyword constraints to narrow a large result set</w:t>
+      </w:r>
+    </w:p>
+    <w:p>
+      <w:pPr>
+        <w:pStyle w:val="Compact"/>
+        <w:numPr>
+          <w:ilvl w:val="0"/>
+          <w:numId w:val="1142"/>
+        </w:numPr>
+      </w:pPr>
+      <w:r>
+        <w:t xml:space="preserve">bypassing the semantic hierarchy when the user already has a keyword in mind</w:t>
+      </w:r>
+    </w:p>
+    <w:p>
+      <w:pPr>
+        <w:pStyle w:val="FirstParagraph"/>
+      </w:pPr>
+      <w:r>
+        <w:t xml:space="preserve">Together, these navigation modes allow SIP-aware interfaces to serve both exploratory and recall-driven user intent without requiring users to begin navigation from the root of the semantic tree.</w:t>
+      </w:r>
+    </w:p>
+    <w:bookmarkEnd w:id="204"/>
+    <w:bookmarkStart w:id="205" w:name="ai-integration-1"/>
+    <w:p>
+      <w:pPr>
+        <w:pStyle w:val="Heading2"/>
+      </w:pPr>
+      <w:r>
+        <w:t xml:space="preserve">AI Integration</w:t>
+      </w:r>
+    </w:p>
+    <w:p>
+      <w:pPr>
+        <w:pStyle w:val="FirstParagraph"/>
+      </w:pPr>
+      <w:r>
+        <w:t xml:space="preserve">Semantic path search may also serve as an AI-mediated interface layer.</w:t>
+      </w:r>
+    </w:p>
+    <w:p>
+      <w:pPr>
+        <w:pStyle w:val="BodyText"/>
+      </w:pPr>
+      <w:r>
+        <w:t xml:space="preserve">An AI assistant may translate natural language intent into a boolean search expression.</w:t>
+      </w:r>
+    </w:p>
+    <w:p>
+      <w:pPr>
+        <w:pStyle w:val="BodyText"/>
+      </w:pPr>
+      <w:r>
+        <w:t xml:space="preserve">Example:</w:t>
+      </w:r>
+    </w:p>
+    <w:p>
+      <w:pPr>
+        <w:pStyle w:val="BodyText"/>
+      </w:pPr>
+      <w:r>
+        <w:t xml:space="preserve">User says:</w:t>
+      </w:r>
+    </w:p>
+    <w:p>
+      <w:pPr>
+        <w:pStyle w:val="BodyText"/>
+      </w:pPr>
+      <w:r>
+        <w:t xml:space="preserve">Find abstract board games that involve stacking or columns mechanics.</w:t>
+      </w:r>
+    </w:p>
+    <w:p>
+      <w:pPr>
+        <w:pStyle w:val="BodyText"/>
+      </w:pPr>
+      <w:r>
+        <w:t xml:space="preserve">AI-generated search expression:</w:t>
+      </w:r>
+    </w:p>
+    <w:p>
+      <w:pPr>
+        <w:pStyle w:val="SourceCode"/>
+      </w:pPr>
+      <w:r>
+        <w:rPr>
+          <w:rStyle w:val="VerbatimChar"/>
+        </w:rPr>
+        <w:t xml:space="preserve">(stacking | columns) &amp; abstract</w:t>
+      </w:r>
+    </w:p>
+    <w:p>
+      <w:pPr>
+        <w:pStyle w:val="FirstParagraph"/>
+      </w:pPr>
+      <w:r>
+        <w:t xml:space="preserve">The search engine may return matching owner-bound identities, discovery paths, and shortcut aliases.</w:t>
+      </w:r>
+    </w:p>
+    <w:p>
+      <w:pPr>
+        <w:pStyle w:val="BodyText"/>
+      </w:pPr>
+      <w:r>
+        <w:t xml:space="preserve">The AI may then rank, explain, and present these results contextually.</w:t>
+      </w:r>
+    </w:p>
+    <w:bookmarkEnd w:id="205"/>
+    <w:bookmarkStart w:id="206" w:name="architectural-implications-5"/>
+    <w:p>
+      <w:pPr>
+        <w:pStyle w:val="Heading2"/>
+      </w:pPr>
+      <w:r>
+        <w:t xml:space="preserve">Architectural Implications</w:t>
+      </w:r>
+    </w:p>
+    <w:p>
+      <w:pPr>
+        <w:pStyle w:val="FirstParagraph"/>
+      </w:pPr>
+      <w:r>
+        <w:t xml:space="preserve">Semantic path search further reinforces that SIP is:</w:t>
+      </w:r>
+    </w:p>
+    <w:p>
+      <w:pPr>
+        <w:pStyle w:val="Compact"/>
+        <w:numPr>
+          <w:ilvl w:val="0"/>
+          <w:numId w:val="1143"/>
+        </w:numPr>
+      </w:pPr>
+      <w:r>
+        <w:rPr>
+          <w:b/>
+          <w:bCs/>
+        </w:rPr>
+        <w:t xml:space="preserve">queryable</w:t>
+      </w:r>
+      <w:r>
+        <w:t xml:space="preserve"> </w:t>
+      </w:r>
+      <w:r>
+        <w:t xml:space="preserve">— users and AI systems may retrieve SIP identities using structured keyword expressions</w:t>
+      </w:r>
+    </w:p>
+    <w:p>
+      <w:pPr>
+        <w:pStyle w:val="Compact"/>
+        <w:numPr>
+          <w:ilvl w:val="0"/>
+          <w:numId w:val="1143"/>
+        </w:numPr>
+      </w:pPr>
+      <w:r>
+        <w:rPr>
+          <w:b/>
+          <w:bCs/>
+        </w:rPr>
+        <w:t xml:space="preserve">AI-navigable</w:t>
+      </w:r>
+      <w:r>
+        <w:t xml:space="preserve"> </w:t>
+      </w:r>
+      <w:r>
+        <w:t xml:space="preserve">— boolean queries may be automatically generated from natural language intent</w:t>
+      </w:r>
+    </w:p>
+    <w:p>
+      <w:pPr>
+        <w:pStyle w:val="Compact"/>
+        <w:numPr>
+          <w:ilvl w:val="0"/>
+          <w:numId w:val="1143"/>
+        </w:numPr>
+      </w:pPr>
+      <w:r>
+        <w:rPr>
+          <w:b/>
+          <w:bCs/>
+        </w:rPr>
+        <w:t xml:space="preserve">context-aware</w:t>
+      </w:r>
+      <w:r>
+        <w:t xml:space="preserve"> </w:t>
+      </w:r>
+      <w:r>
+        <w:t xml:space="preserve">— personal shortcuts are included only within the user’s trusted resolver context</w:t>
+      </w:r>
+    </w:p>
+    <w:p>
+      <w:pPr>
+        <w:pStyle w:val="Compact"/>
+        <w:numPr>
+          <w:ilvl w:val="0"/>
+          <w:numId w:val="1143"/>
+        </w:numPr>
+      </w:pPr>
+      <w:r>
+        <w:rPr>
+          <w:b/>
+          <w:bCs/>
+        </w:rPr>
+        <w:t xml:space="preserve">federated</w:t>
+      </w:r>
+      <w:r>
+        <w:t xml:space="preserve"> </w:t>
+      </w:r>
+      <w:r>
+        <w:t xml:space="preserve">— search results may aggregate identity records across multiple Semantic Identity Providers</w:t>
+      </w:r>
+    </w:p>
+    <w:p>
+      <w:pPr>
+        <w:pStyle w:val="Compact"/>
+        <w:numPr>
+          <w:ilvl w:val="0"/>
+          <w:numId w:val="1143"/>
+        </w:numPr>
+      </w:pPr>
+      <w:r>
+        <w:rPr>
+          <w:b/>
+          <w:bCs/>
+        </w:rPr>
+        <w:t xml:space="preserve">meaning-oriented</w:t>
+      </w:r>
+      <w:r>
+        <w:t xml:space="preserve"> </w:t>
+      </w:r>
+      <w:r>
+        <w:t xml:space="preserve">— search matches against semantic labels and human-readable descriptions as well as raw path strings</w:t>
+      </w:r>
+    </w:p>
+    <w:p>
+      <w:r>
+        <w:pict>
+          <v:rect style="width:0;height:1.5pt" o:hralign="center" o:hrstd="t" o:hr="t"/>
+        </w:pict>
+      </w:r>
+    </w:p>
+    <w:bookmarkEnd w:id="206"/>
+    <w:bookmarkEnd w:id="207"/>
     <w:sectPr>
       <w:footnotePr>
         <w:numRestart w:val="eachSect"/>
@@ -20570,6 +21848,51 @@
     <w:abstractNumId w:val="991"/>
   </w:num>
   <w:num w:numId="1137">
+    <w:abstractNumId w:val="991"/>
+  </w:num>
+  <w:num w:numId="1138">
+    <w:abstractNumId w:val="991"/>
+  </w:num>
+  <w:num w:numId="1139">
+    <w:abstractNumId w:val="991"/>
+  </w:num>
+  <w:num w:numId="1140">
+    <w:abstractNumId w:val="99411"/>
+    <w:lvlOverride w:ilvl="0">
+      <w:startOverride w:val="1"/>
+    </w:lvlOverride>
+    <w:lvlOverride w:ilvl="1">
+      <w:startOverride w:val="1"/>
+    </w:lvlOverride>
+    <w:lvlOverride w:ilvl="2">
+      <w:startOverride w:val="1"/>
+    </w:lvlOverride>
+    <w:lvlOverride w:ilvl="3">
+      <w:startOverride w:val="1"/>
+    </w:lvlOverride>
+    <w:lvlOverride w:ilvl="4">
+      <w:startOverride w:val="1"/>
+    </w:lvlOverride>
+    <w:lvlOverride w:ilvl="5">
+      <w:startOverride w:val="1"/>
+    </w:lvlOverride>
+    <w:lvlOverride w:ilvl="6">
+      <w:startOverride w:val="1"/>
+    </w:lvlOverride>
+    <w:lvlOverride w:ilvl="7">
+      <w:startOverride w:val="1"/>
+    </w:lvlOverride>
+    <w:lvlOverride w:ilvl="8">
+      <w:startOverride w:val="1"/>
+    </w:lvlOverride>
+  </w:num>
+  <w:num w:numId="1141">
+    <w:abstractNumId w:val="991"/>
+  </w:num>
+  <w:num w:numId="1142">
+    <w:abstractNumId w:val="991"/>
+  </w:num>
+  <w:num w:numId="1143">
     <w:abstractNumId w:val="991"/>
   </w:num>
 </w:numbering>

</xml_diff>

<commit_message>
Updated SIP_Whitepaper.docx from SIP_Whitepaper.md
</commit_message>
<xml_diff>
--- a/Docs/SIP_Whitepaper.docx
+++ b/Docs/SIP_Whitepaper.docx
@@ -19416,7 +19416,7 @@
     </w:p>
     <w:bookmarkEnd w:id="193"/>
     <w:bookmarkEnd w:id="194"/>
-    <w:bookmarkStart w:id="207" w:name="semantic-path-search"/>
+    <w:bookmarkStart w:id="208" w:name="semantic-path-search"/>
     <w:p>
       <w:pPr>
         <w:pStyle w:val="Heading1"/>
@@ -19593,7 +19593,7 @@
       </w:r>
     </w:p>
     <w:bookmarkEnd w:id="195"/>
-    <w:bookmarkStart w:id="200" w:name="boolean-keyword-expressions"/>
+    <w:bookmarkStart w:id="201" w:name="boolean-keyword-expressions"/>
     <w:p>
       <w:pPr>
         <w:pStyle w:val="Heading2"/>
@@ -19780,7 +19780,144 @@
       </w:r>
     </w:p>
     <w:bookmarkEnd w:id="197"/>
-    <w:bookmarkStart w:id="198" w:name="grouped-expressions"/>
+    <w:bookmarkStart w:id="198" w:name="not-expressions"/>
+    <w:p>
+      <w:pPr>
+        <w:pStyle w:val="Heading3"/>
+      </w:pPr>
+      <w:r>
+        <w:t xml:space="preserve">NOT Expressions</w:t>
+      </w:r>
+    </w:p>
+    <w:p>
+      <w:pPr>
+        <w:pStyle w:val="FirstParagraph"/>
+      </w:pPr>
+      <w:r>
+        <w:t xml:space="preserve">A keyword prefixed with</w:t>
+      </w:r>
+      <w:r>
+        <w:t xml:space="preserve"> </w:t>
+      </w:r>
+      <w:r>
+        <w:rPr>
+          <w:rStyle w:val="VerbatimChar"/>
+        </w:rPr>
+        <w:t xml:space="preserve">!</w:t>
+      </w:r>
+      <w:r>
+        <w:t xml:space="preserve"> </w:t>
+      </w:r>
+      <w:r>
+        <w:t xml:space="preserve">excludes results that match that keyword.</w:t>
+      </w:r>
+    </w:p>
+    <w:p>
+      <w:pPr>
+        <w:pStyle w:val="BodyText"/>
+      </w:pPr>
+      <w:r>
+        <w:t xml:space="preserve">Example:</w:t>
+      </w:r>
+    </w:p>
+    <w:p>
+      <w:pPr>
+        <w:pStyle w:val="SourceCode"/>
+      </w:pPr>
+      <w:r>
+        <w:rPr>
+          <w:rStyle w:val="VerbatimChar"/>
+        </w:rPr>
+        <w:t xml:space="preserve">chess !checkers</w:t>
+      </w:r>
+    </w:p>
+    <w:p>
+      <w:pPr>
+        <w:pStyle w:val="FirstParagraph"/>
+      </w:pPr>
+      <w:r>
+        <w:t xml:space="preserve">Returns SIP identities containing chess but not checkers.</w:t>
+      </w:r>
+    </w:p>
+    <w:p>
+      <w:pPr>
+        <w:pStyle w:val="BodyText"/>
+      </w:pPr>
+      <w:r>
+        <w:t xml:space="preserve">NOT may also be applied to grouped sub-expressions:</w:t>
+      </w:r>
+    </w:p>
+    <w:p>
+      <w:pPr>
+        <w:pStyle w:val="SourceCode"/>
+      </w:pPr>
+      <w:r>
+        <w:rPr>
+          <w:rStyle w:val="VerbatimChar"/>
+        </w:rPr>
+        <w:t xml:space="preserve">chess !(checkers | draughts)</w:t>
+      </w:r>
+    </w:p>
+    <w:p>
+      <w:pPr>
+        <w:pStyle w:val="FirstParagraph"/>
+      </w:pPr>
+      <w:r>
+        <w:t xml:space="preserve">Returns SIP identities containing chess but not checkers and not draughts.</w:t>
+      </w:r>
+    </w:p>
+    <w:p>
+      <w:pPr>
+        <w:pStyle w:val="BodyText"/>
+      </w:pPr>
+      <w:r>
+        <w:t xml:space="preserve">NOT binds to the immediately following term or group. A space before</w:t>
+      </w:r>
+      <w:r>
+        <w:t xml:space="preserve"> </w:t>
+      </w:r>
+      <w:r>
+        <w:rPr>
+          <w:rStyle w:val="VerbatimChar"/>
+        </w:rPr>
+        <w:t xml:space="preserve">!</w:t>
+      </w:r>
+      <w:r>
+        <w:t xml:space="preserve"> </w:t>
+      </w:r>
+      <w:r>
+        <w:t xml:space="preserve">is treated as an implicit AND, so</w:t>
+      </w:r>
+      <w:r>
+        <w:t xml:space="preserve"> </w:t>
+      </w:r>
+      <w:r>
+        <w:rPr>
+          <w:rStyle w:val="VerbatimChar"/>
+        </w:rPr>
+        <w:t xml:space="preserve">chess !checkers</w:t>
+      </w:r>
+      <w:r>
+        <w:t xml:space="preserve"> </w:t>
+      </w:r>
+      <w:r>
+        <w:t xml:space="preserve">is equivalent to</w:t>
+      </w:r>
+      <w:r>
+        <w:t xml:space="preserve"> </w:t>
+      </w:r>
+      <w:r>
+        <w:rPr>
+          <w:rStyle w:val="VerbatimChar"/>
+        </w:rPr>
+        <w:t xml:space="preserve">chess &amp; !checkers</w:t>
+      </w:r>
+      <w:r>
+        <w:t xml:space="preserve">.</w:t>
+      </w:r>
+    </w:p>
+    <w:bookmarkEnd w:id="198"/>
+    <w:bookmarkStart w:id="199" w:name="grouped-expressions"/>
     <w:p>
       <w:pPr>
         <w:pStyle w:val="Heading3"/>
@@ -19833,8 +19970,8 @@
         <w:t xml:space="preserve">Both expressions return SIP identities that contain columns and at least one of chess or checkers.</w:t>
       </w:r>
     </w:p>
-    <w:bookmarkEnd w:id="198"/>
-    <w:bookmarkStart w:id="199" w:name="operator-precedence"/>
+    <w:bookmarkEnd w:id="199"/>
+    <w:bookmarkStart w:id="200" w:name="operator-precedence"/>
     <w:p>
       <w:pPr>
         <w:pStyle w:val="Heading3"/>
@@ -19939,9 +20076,9 @@
         <w:t xml:space="preserve">Parentheses may be used to override default precedence explicitly.</w:t>
       </w:r>
     </w:p>
-    <w:bookmarkEnd w:id="199"/>
     <w:bookmarkEnd w:id="200"/>
-    <w:bookmarkStart w:id="201" w:name="synonym-aware-matching"/>
+    <w:bookmarkEnd w:id="201"/>
+    <w:bookmarkStart w:id="202" w:name="synonym-aware-matching"/>
     <w:p>
       <w:pPr>
         <w:pStyle w:val="Heading2"/>
@@ -20124,8 +20261,8 @@
         <w:t xml:space="preserve">This allows search to behave naturally with the semantic vocabulary users already know, without requiring them to memorize which segment wording is canonical in a given part of the SIP hierarchy.</w:t>
       </w:r>
     </w:p>
-    <w:bookmarkEnd w:id="201"/>
-    <w:bookmarkStart w:id="202" w:name="search-scope"/>
+    <w:bookmarkEnd w:id="202"/>
+    <w:bookmarkStart w:id="203" w:name="search-scope"/>
     <w:p>
       <w:pPr>
         <w:pStyle w:val="Heading2"/>
@@ -20238,8 +20375,8 @@
         <w:t xml:space="preserve">Search matching may be applied to both the SIP path string and any associated human-readable label or description.</w:t>
       </w:r>
     </w:p>
-    <w:bookmarkEnd w:id="202"/>
-    <w:bookmarkStart w:id="203" w:name="selecting-search-results"/>
+    <w:bookmarkEnd w:id="203"/>
+    <w:bookmarkStart w:id="204" w:name="selecting-search-results"/>
     <w:p>
       <w:pPr>
         <w:pStyle w:val="Heading2"/>
@@ -20334,8 +20471,8 @@
         <w:t xml:space="preserve">Semantic IntelliSense may then offer continuations or owner-bound candidates from that point</w:t>
       </w:r>
     </w:p>
-    <w:bookmarkEnd w:id="203"/>
-    <w:bookmarkStart w:id="204" w:name="relationship-to-semantic-intellisense"/>
+    <w:bookmarkEnd w:id="204"/>
+    <w:bookmarkStart w:id="205" w:name="relationship-to-semantic-intellisense"/>
     <w:p>
       <w:pPr>
         <w:pStyle w:val="Heading2"/>
@@ -20472,8 +20609,8 @@
         <w:t xml:space="preserve">Together, these navigation modes allow SIP-aware interfaces to serve both exploratory and recall-driven user intent without requiring users to begin navigation from the root of the semantic tree.</w:t>
       </w:r>
     </w:p>
-    <w:bookmarkEnd w:id="204"/>
-    <w:bookmarkStart w:id="205" w:name="ai-integration-1"/>
+    <w:bookmarkEnd w:id="205"/>
+    <w:bookmarkStart w:id="206" w:name="ai-integration-1"/>
     <w:p>
       <w:pPr>
         <w:pStyle w:val="Heading2"/>
@@ -20557,8 +20694,8 @@
         <w:t xml:space="preserve">The AI may then rank, explain, and present these results contextually.</w:t>
       </w:r>
     </w:p>
-    <w:bookmarkEnd w:id="205"/>
-    <w:bookmarkStart w:id="206" w:name="architectural-implications-5"/>
+    <w:bookmarkEnd w:id="206"/>
+    <w:bookmarkStart w:id="207" w:name="architectural-implications-5"/>
     <w:p>
       <w:pPr>
         <w:pStyle w:val="Heading2"/>
@@ -20692,8 +20829,548 @@
         </w:pict>
       </w:r>
     </w:p>
-    <w:bookmarkEnd w:id="206"/>
     <w:bookmarkEnd w:id="207"/>
+    <w:bookmarkEnd w:id="208"/>
+    <w:bookmarkStart w:id="215" w:name="Xdf0ac2601b14c3c17626e898054ff49a24469be"/>
+    <w:p>
+      <w:pPr>
+        <w:pStyle w:val="Heading1"/>
+      </w:pPr>
+      <w:r>
+        <w:t xml:space="preserve">Resource-Type Expression Through Owner Binding Levels</w:t>
+      </w:r>
+    </w:p>
+    <w:p>
+      <w:pPr>
+        <w:pStyle w:val="FirstParagraph"/>
+      </w:pPr>
+      <w:r>
+        <w:t xml:space="preserve">An owner-bound SIP identifies who holds an identity, but it does not inherently communicate what kind of resource the destination offers. Is it a place to play the game, read about it, purchase it, watch others play it, or something else entirely?</w:t>
+      </w:r>
+    </w:p>
+    <w:p>
+      <w:pPr>
+        <w:pStyle w:val="BodyText"/>
+      </w:pPr>
+      <w:r>
+        <w:t xml:space="preserve">SIP supports three coexisting approaches to expressing resource-type intent. All three are valid. No single form is mandated. Canonical convention will emerge naturally from adoption patterns across the ecosystem.</w:t>
+      </w:r>
+    </w:p>
+    <w:bookmarkStart w:id="209" w:name="option-a-terminal-qualifiers"/>
+    <w:p>
+      <w:pPr>
+        <w:pStyle w:val="Heading2"/>
+      </w:pPr>
+      <w:r>
+        <w:t xml:space="preserve">Option A — Terminal Qualifiers</w:t>
+      </w:r>
+    </w:p>
+    <w:p>
+      <w:pPr>
+        <w:pStyle w:val="FirstParagraph"/>
+      </w:pPr>
+      <w:r>
+        <w:t xml:space="preserve">Resource type is expressed as a terminal path segment appended to the game or concept identity:</w:t>
+      </w:r>
+    </w:p>
+    <w:p>
+      <w:pPr>
+        <w:pStyle w:val="SourceCode"/>
+      </w:pPr>
+      <w:r>
+        <w:rPr>
+          <w:rStyle w:val="VerbatimChar"/>
+        </w:rPr>
+        <w:t xml:space="preserve">@ogs.games.strategy.abstract.territory.enclosure.go.online</w:t>
+      </w:r>
+      <w:r>
+        <w:br/>
+      </w:r>
+      <w:r>
+        <w:rPr>
+          <w:rStyle w:val="VerbatimChar"/>
+        </w:rPr>
+        <w:t xml:space="preserve">@senseis.games.strategy.abstract.territory.enclosure.go.strategy</w:t>
+      </w:r>
+      <w:r>
+        <w:br/>
+      </w:r>
+      <w:r>
+        <w:rPr>
+          <w:rStyle w:val="VerbatimChar"/>
+        </w:rPr>
+        <w:t xml:space="preserve">@wikipedia.games.strategy.abstract.territory.enclosure.go.rules</w:t>
+      </w:r>
+    </w:p>
+    <w:p>
+      <w:pPr>
+        <w:pStyle w:val="FirstParagraph"/>
+      </w:pPr>
+      <w:r>
+        <w:t xml:space="preserve">Each resource-type segment is a semantic child of the concept node. The game taxonomy tree already carries these as valid continuations:</w:t>
+      </w:r>
+    </w:p>
+    <w:p>
+      <w:pPr>
+        <w:pStyle w:val="SourceCode"/>
+      </w:pPr>
+      <w:r>
+        <w:rPr>
+          <w:rStyle w:val="VerbatimChar"/>
+        </w:rPr>
+        <w:t xml:space="preserve">games.strategy.abstract.territory.enclosure.go</w:t>
+      </w:r>
+      <w:r>
+        <w:br/>
+      </w:r>
+      <w:r>
+        <w:rPr>
+          <w:rStyle w:val="VerbatimChar"/>
+        </w:rPr>
+        <w:t xml:space="preserve">  ├── online</w:t>
+      </w:r>
+      <w:r>
+        <w:br/>
+      </w:r>
+      <w:r>
+        <w:rPr>
+          <w:rStyle w:val="VerbatimChar"/>
+        </w:rPr>
+        <w:t xml:space="preserve">  ├── rules</w:t>
+      </w:r>
+      <w:r>
+        <w:br/>
+      </w:r>
+      <w:r>
+        <w:rPr>
+          <w:rStyle w:val="VerbatimChar"/>
+        </w:rPr>
+        <w:t xml:space="preserve">  ├── strategy</w:t>
+      </w:r>
+      <w:r>
+        <w:br/>
+      </w:r>
+      <w:r>
+        <w:rPr>
+          <w:rStyle w:val="VerbatimChar"/>
+        </w:rPr>
+        <w:t xml:space="preserve">  ├── history</w:t>
+      </w:r>
+      <w:r>
+        <w:br/>
+      </w:r>
+      <w:r>
+        <w:rPr>
+          <w:rStyle w:val="VerbatimChar"/>
+        </w:rPr>
+        <w:t xml:space="preserve">  ├── variants</w:t>
+      </w:r>
+      <w:r>
+        <w:br/>
+      </w:r>
+      <w:r>
+        <w:rPr>
+          <w:rStyle w:val="VerbatimChar"/>
+        </w:rPr>
+        <w:t xml:space="preserve">  ├── tournaments</w:t>
+      </w:r>
+      <w:r>
+        <w:br/>
+      </w:r>
+      <w:r>
+        <w:rPr>
+          <w:rStyle w:val="VerbatimChar"/>
+        </w:rPr>
+        <w:t xml:space="preserve">  └── tutorials</w:t>
+      </w:r>
+    </w:p>
+    <w:p>
+      <w:pPr>
+        <w:pStyle w:val="FirstParagraph"/>
+      </w:pPr>
+      <w:r>
+        <w:t xml:space="preserve">Owners may register bindings at any level. OGS might bind</w:t>
+      </w:r>
+      <w:r>
+        <w:t xml:space="preserve"> </w:t>
+      </w:r>
+      <w:r>
+        <w:rPr>
+          <w:rStyle w:val="VerbatimChar"/>
+        </w:rPr>
+        <w:t xml:space="preserve">go.online</w:t>
+      </w:r>
+      <w:r>
+        <w:t xml:space="preserve"> </w:t>
+      </w:r>
+      <w:r>
+        <w:t xml:space="preserve">to their play environment and</w:t>
+      </w:r>
+      <w:r>
+        <w:t xml:space="preserve"> </w:t>
+      </w:r>
+      <w:r>
+        <w:rPr>
+          <w:rStyle w:val="VerbatimChar"/>
+        </w:rPr>
+        <w:t xml:space="preserve">go.tournaments</w:t>
+      </w:r>
+      <w:r>
+        <w:t xml:space="preserve"> </w:t>
+      </w:r>
+      <w:r>
+        <w:t xml:space="preserve">to their tournament calendar. Wikipedia might bind</w:t>
+      </w:r>
+      <w:r>
+        <w:t xml:space="preserve"> </w:t>
+      </w:r>
+      <w:r>
+        <w:rPr>
+          <w:rStyle w:val="VerbatimChar"/>
+        </w:rPr>
+        <w:t xml:space="preserve">go.rules</w:t>
+      </w:r>
+      <w:r>
+        <w:t xml:space="preserve"> </w:t>
+      </w:r>
+      <w:r>
+        <w:t xml:space="preserve">and</w:t>
+      </w:r>
+      <w:r>
+        <w:t xml:space="preserve"> </w:t>
+      </w:r>
+      <w:r>
+        <w:rPr>
+          <w:rStyle w:val="VerbatimChar"/>
+        </w:rPr>
+        <w:t xml:space="preserve">go.history</w:t>
+      </w:r>
+      <w:r>
+        <w:t xml:space="preserve"> </w:t>
+      </w:r>
+      <w:r>
+        <w:t xml:space="preserve">to the corresponding article sections.</w:t>
+      </w:r>
+    </w:p>
+    <w:p>
+      <w:pPr>
+        <w:pStyle w:val="BodyText"/>
+      </w:pPr>
+      <w:r>
+        <w:t xml:space="preserve">This approach is the most semantically precise. The SIP itself is self-describing, navigable via IntelliSense, and machine-readable without out-of-band knowledge.</w:t>
+      </w:r>
+    </w:p>
+    <w:bookmarkEnd w:id="209"/>
+    <w:bookmarkStart w:id="210" w:name="option-b-owner-implicit-binding"/>
+    <w:p>
+      <w:pPr>
+        <w:pStyle w:val="Heading2"/>
+      </w:pPr>
+      <w:r>
+        <w:t xml:space="preserve">Option B — Owner-Implicit Binding</w:t>
+      </w:r>
+    </w:p>
+    <w:p>
+      <w:pPr>
+        <w:pStyle w:val="FirstParagraph"/>
+      </w:pPr>
+      <w:r>
+        <w:t xml:space="preserve">Resource type is inferred from the owner rather than stated in the path:</w:t>
+      </w:r>
+    </w:p>
+    <w:p>
+      <w:pPr>
+        <w:pStyle w:val="SourceCode"/>
+      </w:pPr>
+      <w:r>
+        <w:rPr>
+          <w:rStyle w:val="VerbatimChar"/>
+        </w:rPr>
+        <w:t xml:space="preserve">@ogs.games.strategy.abstract.territory.enclosure.go</w:t>
+      </w:r>
+    </w:p>
+    <w:p>
+      <w:pPr>
+        <w:pStyle w:val="FirstParagraph"/>
+      </w:pPr>
+      <w:r>
+        <w:t xml:space="preserve">Here, the path ends at the concept level. The resource type is implied by the owner’s well-known profile: OGS is an online Go platform, so the destination is implicitly a place to play. No additional segment is needed.</w:t>
+      </w:r>
+    </w:p>
+    <w:p>
+      <w:pPr>
+        <w:pStyle w:val="BodyText"/>
+      </w:pPr>
+      <w:r>
+        <w:t xml:space="preserve">This approach produces shorter SIP strings and works well when the owner is unambiguous and widely known.</w:t>
+      </w:r>
+    </w:p>
+    <w:bookmarkEnd w:id="210"/>
+    <w:bookmarkStart w:id="211" w:name="option-c-namespace-intent"/>
+    <w:p>
+      <w:pPr>
+        <w:pStyle w:val="Heading2"/>
+      </w:pPr>
+      <w:r>
+        <w:t xml:space="preserve">Option C — Namespace Intent</w:t>
+      </w:r>
+    </w:p>
+    <w:p>
+      <w:pPr>
+        <w:pStyle w:val="FirstParagraph"/>
+      </w:pPr>
+      <w:r>
+        <w:t xml:space="preserve">Resource type is inserted as an intent segment between the owner namespace and the discovery path:</w:t>
+      </w:r>
+    </w:p>
+    <w:p>
+      <w:pPr>
+        <w:pStyle w:val="SourceCode"/>
+      </w:pPr>
+      <w:r>
+        <w:rPr>
+          <w:rStyle w:val="VerbatimChar"/>
+        </w:rPr>
+        <w:t xml:space="preserve">@ogs.play.games.strategy.abstract.territory.enclosure.go</w:t>
+      </w:r>
+      <w:r>
+        <w:br/>
+      </w:r>
+      <w:r>
+        <w:rPr>
+          <w:rStyle w:val="VerbatimChar"/>
+        </w:rPr>
+        <w:t xml:space="preserve">@wikipedia.ref.games.strategy.abstract.territory.enclosure.go</w:t>
+      </w:r>
+    </w:p>
+    <w:p>
+      <w:pPr>
+        <w:pStyle w:val="FirstParagraph"/>
+      </w:pPr>
+      <w:r>
+        <w:t xml:space="preserve">The intent segment (</w:t>
+      </w:r>
+      <w:r>
+        <w:rPr>
+          <w:rStyle w:val="VerbatimChar"/>
+        </w:rPr>
+        <w:t xml:space="preserve">play</w:t>
+      </w:r>
+      <w:r>
+        <w:t xml:space="preserve">,</w:t>
+      </w:r>
+      <w:r>
+        <w:t xml:space="preserve"> </w:t>
+      </w:r>
+      <w:r>
+        <w:rPr>
+          <w:rStyle w:val="VerbatimChar"/>
+        </w:rPr>
+        <w:t xml:space="preserve">ref</w:t>
+      </w:r>
+      <w:r>
+        <w:t xml:space="preserve">,</w:t>
+      </w:r>
+      <w:r>
+        <w:t xml:space="preserve"> </w:t>
+      </w:r>
+      <w:r>
+        <w:rPr>
+          <w:rStyle w:val="VerbatimChar"/>
+        </w:rPr>
+        <w:t xml:space="preserve">buy</w:t>
+      </w:r>
+      <w:r>
+        <w:t xml:space="preserve">,</w:t>
+      </w:r>
+      <w:r>
+        <w:t xml:space="preserve"> </w:t>
+      </w:r>
+      <w:r>
+        <w:rPr>
+          <w:rStyle w:val="VerbatimChar"/>
+        </w:rPr>
+        <w:t xml:space="preserve">watch</w:t>
+      </w:r>
+      <w:r>
+        <w:t xml:space="preserve">) appears directly after the owner namespace. The discovery portion of the path remains structurally intact.</w:t>
+      </w:r>
+    </w:p>
+    <w:p>
+      <w:pPr>
+        <w:pStyle w:val="BodyText"/>
+      </w:pPr>
+      <w:r>
+        <w:t xml:space="preserve">This approach is fully self-describing without any out-of-band knowledge of the owner’s profile. It also supports machine-readable classification: a resolver that encounters</w:t>
+      </w:r>
+      <w:r>
+        <w:t xml:space="preserve"> </w:t>
+      </w:r>
+      <w:r>
+        <w:rPr>
+          <w:rStyle w:val="VerbatimChar"/>
+        </w:rPr>
+        <w:t xml:space="preserve">.play.games.</w:t>
+      </w:r>
+      <w:r>
+        <w:t xml:space="preserve"> </w:t>
+      </w:r>
+      <w:r>
+        <w:t xml:space="preserve">can infer playable intent without consulting a knowledge base about the owner. The trade-off is longer SIP strings.</w:t>
+      </w:r>
+    </w:p>
+    <w:bookmarkEnd w:id="211"/>
+    <w:bookmarkStart w:id="212" w:name="all-three-coexist"/>
+    <w:p>
+      <w:pPr>
+        <w:pStyle w:val="Heading2"/>
+      </w:pPr>
+      <w:r>
+        <w:t xml:space="preserve">All Three Coexist</w:t>
+      </w:r>
+    </w:p>
+    <w:p>
+      <w:pPr>
+        <w:pStyle w:val="FirstParagraph"/>
+      </w:pPr>
+      <w:r>
+        <w:t xml:space="preserve">These approaches are not in conflict. A single owner may register multiple bindings simultaneously at different levels:</w:t>
+      </w:r>
+    </w:p>
+    <w:p>
+      <w:pPr>
+        <w:pStyle w:val="SourceCode"/>
+      </w:pPr>
+      <w:r>
+        <w:rPr>
+          <w:rStyle w:val="VerbatimChar"/>
+        </w:rPr>
+        <w:t xml:space="preserve">@ogs.games.strategy.abstract.territory.enclosure.go          (Option B — owner-implicit)</w:t>
+      </w:r>
+      <w:r>
+        <w:br/>
+      </w:r>
+      <w:r>
+        <w:rPr>
+          <w:rStyle w:val="VerbatimChar"/>
+        </w:rPr>
+        <w:t xml:space="preserve">@ogs.games.strategy.abstract.territory.enclosure.go.online   (Option A — terminal qualifier)</w:t>
+      </w:r>
+      <w:r>
+        <w:br/>
+      </w:r>
+      <w:r>
+        <w:rPr>
+          <w:rStyle w:val="VerbatimChar"/>
+        </w:rPr>
+        <w:t xml:space="preserve">@ogs.play.games.strategy.abstract.territory.enclosure.go     (Option C — namespace intent)</w:t>
+      </w:r>
+    </w:p>
+    <w:p>
+      <w:pPr>
+        <w:pStyle w:val="FirstParagraph"/>
+      </w:pPr>
+      <w:r>
+        <w:t xml:space="preserve">All three may resolve to the same OGS play destination, or to subtly different entry points within the same platform. The resolver presents all registered bindings and lets the user choose the level of specificity they prefer.</w:t>
+      </w:r>
+    </w:p>
+    <w:bookmarkEnd w:id="212"/>
+    <w:bookmarkStart w:id="213" w:name="evolutionary-convention"/>
+    <w:p>
+      <w:pPr>
+        <w:pStyle w:val="Heading2"/>
+      </w:pPr>
+      <w:r>
+        <w:t xml:space="preserve">Evolutionary Convention</w:t>
+      </w:r>
+    </w:p>
+    <w:p>
+      <w:pPr>
+        <w:pStyle w:val="FirstParagraph"/>
+      </w:pPr>
+      <w:r>
+        <w:t xml:space="preserve">Which form predominates will emerge from adoption rather than mandate:</w:t>
+      </w:r>
+    </w:p>
+    <w:p>
+      <w:pPr>
+        <w:pStyle w:val="Compact"/>
+        <w:numPr>
+          <w:ilvl w:val="0"/>
+          <w:numId w:val="1144"/>
+        </w:numPr>
+      </w:pPr>
+      <w:r>
+        <w:t xml:space="preserve">Option B provides immediate convenience and is likely to dominate for well-known owners in the early ecosystem, since it requires no change to existing SIP paths.</w:t>
+      </w:r>
+    </w:p>
+    <w:p>
+      <w:pPr>
+        <w:pStyle w:val="Compact"/>
+        <w:numPr>
+          <w:ilvl w:val="0"/>
+          <w:numId w:val="1144"/>
+        </w:numPr>
+      </w:pPr>
+      <w:r>
+        <w:t xml:space="preserve">Option A provides precision and will grow as taxonomies mature and owners begin publishing resource-type-differentiated bindings. IntelliSense can guide users to these terminal qualifiers through normal step-by-step navigation.</w:t>
+      </w:r>
+    </w:p>
+    <w:p>
+      <w:pPr>
+        <w:pStyle w:val="Compact"/>
+        <w:numPr>
+          <w:ilvl w:val="0"/>
+          <w:numId w:val="1144"/>
+        </w:numPr>
+      </w:pPr>
+      <w:r>
+        <w:t xml:space="preserve">Option C provides explicit machine-readable intent and may become the preferred form for AI-native resolution and programmatic SIP generation, where the intent segment can be injected automatically by the calling system.</w:t>
+      </w:r>
+    </w:p>
+    <w:p>
+      <w:pPr>
+        <w:pStyle w:val="FirstParagraph"/>
+      </w:pPr>
+      <w:r>
+        <w:t xml:space="preserve">Resolvers should support all three models simultaneously without conflict. A SIP-aware browser, AI assistant, or integration that encounters any of the three forms should be able to resolve or usefully interpret it.</w:t>
+      </w:r>
+    </w:p>
+    <w:bookmarkEnd w:id="213"/>
+    <w:bookmarkStart w:id="214" w:name="architectural-implication-1"/>
+    <w:p>
+      <w:pPr>
+        <w:pStyle w:val="Heading2"/>
+      </w:pPr>
+      <w:r>
+        <w:t xml:space="preserve">Architectural Implication</w:t>
+      </w:r>
+    </w:p>
+    <w:p>
+      <w:pPr>
+        <w:pStyle w:val="FirstParagraph"/>
+      </w:pPr>
+      <w:r>
+        <w:t xml:space="preserve">The distinction between resource types is not encoded in SIP’s core path grammar — it is expressed through the path itself, just as all other semantic distinctions are. Terminal qualifiers are ordinary child segments. Namespace intent uses ordinary owner-prefix conventions. No special syntax extension is required.</w:t>
+      </w:r>
+    </w:p>
+    <w:p>
+      <w:pPr>
+        <w:pStyle w:val="BodyText"/>
+      </w:pPr>
+      <w:r>
+        <w:t xml:space="preserve">This means resource-type awareness can be layered into any existing SIP implementation at any time by adding bindings, without changing the underlying resolver, grammar, or identity format.</w:t>
+      </w:r>
+    </w:p>
+    <w:p>
+      <w:r>
+        <w:pict>
+          <v:rect style="width:0;height:1.5pt" o:hralign="center" o:hrstd="t" o:hr="t"/>
+        </w:pict>
+      </w:r>
+    </w:p>
+    <w:bookmarkEnd w:id="214"/>
+    <w:bookmarkEnd w:id="215"/>
     <w:sectPr>
       <w:footnotePr>
         <w:numRestart w:val="eachSect"/>
@@ -21893,6 +22570,9 @@
     <w:abstractNumId w:val="991"/>
   </w:num>
   <w:num w:numId="1143">
+    <w:abstractNumId w:val="991"/>
+  </w:num>
+  <w:num w:numId="1144">
     <w:abstractNumId w:val="991"/>
   </w:num>
 </w:numbering>

</xml_diff>

<commit_message>
Update Word documents and add global shortcut registry summary
- SIP_Overview.docx: updated with global shortcut registry content
- SIP_Whitepaper.docx: updated to match whitepaper markdown changes
- SIP_Global_Shortcut_Registry_Summary.md: new concise summary of the
  global shortcut registry model, shortcut tiers, and examples
</commit_message>
<xml_diff>
--- a/Docs/SIP_Whitepaper.docx
+++ b/Docs/SIP_Whitepaper.docx
@@ -23795,6 +23795,3311 @@
     </w:p>
     <w:bookmarkEnd w:id="228"/>
     <w:bookmarkEnd w:id="229"/>
+    <w:bookmarkStart w:id="250" w:name="Xd8142675a1191527267398f3fd748170577c04e"/>
+    <w:p>
+      <w:pPr>
+        <w:pStyle w:val="Heading1"/>
+      </w:pPr>
+      <w:r>
+        <w:t xml:space="preserve">Global Shortcut Registry, Namespace Stewardship, and Domain Aliases</w:t>
+      </w:r>
+    </w:p>
+    <w:bookmarkStart w:id="230" w:name="the-long-path-problem"/>
+    <w:p>
+      <w:pPr>
+        <w:pStyle w:val="Heading2"/>
+      </w:pPr>
+      <w:r>
+        <w:t xml:space="preserve">The Long-Path Problem</w:t>
+      </w:r>
+    </w:p>
+    <w:p>
+      <w:pPr>
+        <w:pStyle w:val="FirstParagraph"/>
+      </w:pPr>
+      <w:r>
+        <w:t xml:space="preserve">A major adoption challenge for SIP is the length of the full owner-bound SIP identity string.</w:t>
+      </w:r>
+    </w:p>
+    <w:p>
+      <w:pPr>
+        <w:pStyle w:val="BodyText"/>
+      </w:pPr>
+      <w:r>
+        <w:t xml:space="preserve">A fully descriptive owner-bound SIP identity may be long in order to be precise, portable, and machine-verifiable. For example:</w:t>
+      </w:r>
+    </w:p>
+    <w:p>
+      <w:pPr>
+        <w:pStyle w:val="SourceCode"/>
+      </w:pPr>
+      <w:r>
+        <w:rPr>
+          <w:rStyle w:val="VerbatimChar"/>
+        </w:rPr>
+        <w:t xml:space="preserve">@owner/edbecnel/stackworks/games/strategy/abstract/capture/leaping/stacking/lasca</w:t>
+      </w:r>
+    </w:p>
+    <w:p>
+      <w:pPr>
+        <w:pStyle w:val="FirstParagraph"/>
+      </w:pPr>
+      <w:r>
+        <w:t xml:space="preserve">This kind of identifier is useful for machines, registries, verification, and long-term ownership tracking. However, it is not practical as the public-facing name that people are expected to type, remember, print, share, or market.</w:t>
+      </w:r>
+    </w:p>
+    <w:p>
+      <w:pPr>
+        <w:pStyle w:val="BodyText"/>
+      </w:pPr>
+      <w:r>
+        <w:t xml:space="preserve">SIP therefore needs a naming model that gives humans short, memorable identifiers while preserving the long canonical SIP identity underneath.</w:t>
+      </w:r>
+    </w:p>
+    <w:p>
+      <w:pPr>
+        <w:pStyle w:val="BodyText"/>
+      </w:pPr>
+      <w:r>
+        <w:t xml:space="preserve">The solution is to separate the human-friendly SIP shortcut from the canonical owner-bound SIP identity.</w:t>
+      </w:r>
+    </w:p>
+    <w:p>
+      <w:pPr>
+        <w:pStyle w:val="BodyText"/>
+      </w:pPr>
+      <w:r>
+        <w:t xml:space="preserve">The full owner-bound SIP path should be treated like a cryptographic or canonical backend identity. It is the permanent truth, but it should not be the primary human interface.</w:t>
+      </w:r>
+    </w:p>
+    <w:p>
+      <w:r>
+        <w:pict>
+          <v:rect style="width:0;height:1.5pt" o:hralign="center" o:hrstd="t" o:hr="t"/>
+        </w:pict>
+      </w:r>
+    </w:p>
+    <w:bookmarkEnd w:id="230"/>
+    <w:bookmarkStart w:id="234" w:name="three-layers-of-sip-identity"/>
+    <w:p>
+      <w:pPr>
+        <w:pStyle w:val="Heading2"/>
+      </w:pPr>
+      <w:r>
+        <w:t xml:space="preserve">Three Layers of SIP Identity</w:t>
+      </w:r>
+    </w:p>
+    <w:p>
+      <w:pPr>
+        <w:pStyle w:val="FirstParagraph"/>
+      </w:pPr>
+      <w:r>
+        <w:t xml:space="preserve">SIP supports three distinct layers of identity:</w:t>
+      </w:r>
+    </w:p>
+    <w:p>
+      <w:pPr>
+        <w:pStyle w:val="Compact"/>
+        <w:numPr>
+          <w:ilvl w:val="0"/>
+          <w:numId w:val="1151"/>
+        </w:numPr>
+      </w:pPr>
+      <w:r>
+        <w:rPr>
+          <w:b/>
+          <w:bCs/>
+        </w:rPr>
+        <w:t xml:space="preserve">Canonical owner-bound SIP identity</w:t>
+      </w:r>
+      <w:r>
+        <w:t xml:space="preserve"> </w:t>
+      </w:r>
+      <w:r>
+        <w:t xml:space="preserve">— the full permanent machine-verifiable record</w:t>
+      </w:r>
+    </w:p>
+    <w:p>
+      <w:pPr>
+        <w:pStyle w:val="Compact"/>
+        <w:numPr>
+          <w:ilvl w:val="0"/>
+          <w:numId w:val="1151"/>
+        </w:numPr>
+      </w:pPr>
+      <w:r>
+        <w:rPr>
+          <w:b/>
+          <w:bCs/>
+        </w:rPr>
+        <w:t xml:space="preserve">SIP shortcut string</w:t>
+      </w:r>
+      <w:r>
+        <w:t xml:space="preserve"> </w:t>
+      </w:r>
+      <w:r>
+        <w:t xml:space="preserve">— a compact</w:t>
+      </w:r>
+      <w:r>
+        <w:t xml:space="preserve"> </w:t>
+      </w:r>
+      <w:r>
+        <w:rPr>
+          <w:rStyle w:val="VerbatimChar"/>
+        </w:rPr>
+        <w:t xml:space="preserve">@</w:t>
+      </w:r>
+      <w:r>
+        <w:t xml:space="preserve">-prefixed human-friendly alias</w:t>
+      </w:r>
+    </w:p>
+    <w:p>
+      <w:pPr>
+        <w:pStyle w:val="Compact"/>
+        <w:numPr>
+          <w:ilvl w:val="0"/>
+          <w:numId w:val="1151"/>
+        </w:numPr>
+      </w:pPr>
+      <w:r>
+        <w:rPr>
+          <w:b/>
+          <w:bCs/>
+        </w:rPr>
+        <w:t xml:space="preserve">Domain-based discovery alias</w:t>
+      </w:r>
+      <w:r>
+        <w:t xml:space="preserve"> </w:t>
+      </w:r>
+      <w:r>
+        <w:t xml:space="preserve">— a familiar web-style entry point that bridges into SIP</w:t>
+      </w:r>
+    </w:p>
+    <w:p>
+      <w:pPr>
+        <w:pStyle w:val="FirstParagraph"/>
+      </w:pPr>
+      <w:r>
+        <w:t xml:space="preserve">These layers are related but they are not the same thing.</w:t>
+      </w:r>
+    </w:p>
+    <w:bookmarkStart w:id="231" w:name="X37e3e0ab9fec9100ebad1ddaaf49be6999a9d0f"/>
+    <w:p>
+      <w:pPr>
+        <w:pStyle w:val="Heading3"/>
+      </w:pPr>
+      <w:r>
+        <w:t xml:space="preserve">Layer 1 — Canonical Owner-Bound SIP Identity</w:t>
+      </w:r>
+    </w:p>
+    <w:p>
+      <w:pPr>
+        <w:pStyle w:val="FirstParagraph"/>
+      </w:pPr>
+      <w:r>
+        <w:t xml:space="preserve">The canonical owner-bound SIP identity is the full permanent identity used internally by resolvers, software, registries, and verification systems.</w:t>
+      </w:r>
+    </w:p>
+    <w:p>
+      <w:pPr>
+        <w:pStyle w:val="BodyText"/>
+      </w:pPr>
+      <w:r>
+        <w:t xml:space="preserve">Example:</w:t>
+      </w:r>
+    </w:p>
+    <w:p>
+      <w:pPr>
+        <w:pStyle w:val="SourceCode"/>
+      </w:pPr>
+      <w:r>
+        <w:rPr>
+          <w:rStyle w:val="VerbatimChar"/>
+        </w:rPr>
+        <w:t xml:space="preserve">@owner/edbecnel/stackworks/games/strategy/abstract/capture/leaping/stacking/lasca</w:t>
+      </w:r>
+    </w:p>
+    <w:p>
+      <w:pPr>
+        <w:pStyle w:val="FirstParagraph"/>
+      </w:pPr>
+      <w:r>
+        <w:t xml:space="preserve">This identity is permanent, owner-bound, machine-verifiable, portable, and explicit. It is suitable for long-term registry records and is not dependent on a domain name. SIP software should ultimately resolve to and verify this form.</w:t>
+      </w:r>
+    </w:p>
+    <w:p>
+      <w:pPr>
+        <w:pStyle w:val="BodyText"/>
+      </w:pPr>
+      <w:r>
+        <w:t xml:space="preserve">However, most users should rarely need to see or type this full string.</w:t>
+      </w:r>
+    </w:p>
+    <w:bookmarkEnd w:id="231"/>
+    <w:bookmarkStart w:id="232" w:name="layer-2-sip-shortcut-strings"/>
+    <w:p>
+      <w:pPr>
+        <w:pStyle w:val="Heading3"/>
+      </w:pPr>
+      <w:r>
+        <w:t xml:space="preserve">Layer 2 — SIP Shortcut Strings</w:t>
+      </w:r>
+    </w:p>
+    <w:p>
+      <w:pPr>
+        <w:pStyle w:val="FirstParagraph"/>
+      </w:pPr>
+      <w:r>
+        <w:t xml:space="preserve">A SIP shortcut string is a shorter SIP-native identifier that begins with</w:t>
+      </w:r>
+      <w:r>
+        <w:t xml:space="preserve"> </w:t>
+      </w:r>
+      <w:r>
+        <w:rPr>
+          <w:rStyle w:val="VerbatimChar"/>
+        </w:rPr>
+        <w:t xml:space="preserve">@</w:t>
+      </w:r>
+      <w:r>
+        <w:t xml:space="preserve">.</w:t>
+      </w:r>
+    </w:p>
+    <w:p>
+      <w:pPr>
+        <w:pStyle w:val="BodyText"/>
+      </w:pPr>
+      <w:r>
+        <w:t xml:space="preserve">Examples:</w:t>
+      </w:r>
+    </w:p>
+    <w:p>
+      <w:pPr>
+        <w:pStyle w:val="SourceCode"/>
+      </w:pPr>
+      <w:r>
+        <w:rPr>
+          <w:rStyle w:val="VerbatimChar"/>
+        </w:rPr>
+        <w:t xml:space="preserve">@stackworks/lasca</w:t>
+      </w:r>
+      <w:r>
+        <w:br/>
+      </w:r>
+      <w:r>
+        <w:rPr>
+          <w:rStyle w:val="VerbatimChar"/>
+        </w:rPr>
+        <w:t xml:space="preserve">@games/lasca</w:t>
+      </w:r>
+      <w:r>
+        <w:br/>
+      </w:r>
+      <w:r>
+        <w:rPr>
+          <w:rStyle w:val="VerbatimChar"/>
+        </w:rPr>
+        <w:t xml:space="preserve">@edbecnel/lasca</w:t>
+      </w:r>
+    </w:p>
+    <w:p>
+      <w:pPr>
+        <w:pStyle w:val="FirstParagraph"/>
+      </w:pPr>
+      <w:r>
+        <w:t xml:space="preserve">These are SIP strings because they begin with</w:t>
+      </w:r>
+      <w:r>
+        <w:t xml:space="preserve"> </w:t>
+      </w:r>
+      <w:r>
+        <w:rPr>
+          <w:rStyle w:val="VerbatimChar"/>
+        </w:rPr>
+        <w:t xml:space="preserve">@</w:t>
+      </w:r>
+      <w:r>
+        <w:t xml:space="preserve">. A shortcut string is a human-friendly SIP identifier that exists to make SIP practical for everyday use.</w:t>
+      </w:r>
+    </w:p>
+    <w:bookmarkEnd w:id="232"/>
+    <w:bookmarkStart w:id="233" w:name="layer-3-domain-based-discovery-aliases"/>
+    <w:p>
+      <w:pPr>
+        <w:pStyle w:val="Heading3"/>
+      </w:pPr>
+      <w:r>
+        <w:t xml:space="preserve">Layer 3 — Domain-Based Discovery Aliases</w:t>
+      </w:r>
+    </w:p>
+    <w:p>
+      <w:pPr>
+        <w:pStyle w:val="FirstParagraph"/>
+      </w:pPr>
+      <w:r>
+        <w:t xml:space="preserve">The following are</w:t>
+      </w:r>
+      <w:r>
+        <w:t xml:space="preserve"> </w:t>
+      </w:r>
+      <w:r>
+        <w:rPr>
+          <w:b/>
+          <w:bCs/>
+        </w:rPr>
+        <w:t xml:space="preserve">not</w:t>
+      </w:r>
+      <w:r>
+        <w:t xml:space="preserve"> </w:t>
+      </w:r>
+      <w:r>
+        <w:t xml:space="preserve">SIP strings:</w:t>
+      </w:r>
+    </w:p>
+    <w:p>
+      <w:pPr>
+        <w:pStyle w:val="SourceCode"/>
+      </w:pPr>
+      <w:r>
+        <w:rPr>
+          <w:rStyle w:val="VerbatimChar"/>
+        </w:rPr>
+        <w:t xml:space="preserve">stackworks.games/lasca</w:t>
+      </w:r>
+      <w:r>
+        <w:br/>
+      </w:r>
+      <w:r>
+        <w:rPr>
+          <w:rStyle w:val="VerbatimChar"/>
+        </w:rPr>
+        <w:t xml:space="preserve">lasca.stackworks.games</w:t>
+      </w:r>
+    </w:p>
+    <w:p>
+      <w:pPr>
+        <w:pStyle w:val="FirstParagraph"/>
+      </w:pPr>
+      <w:r>
+        <w:t xml:space="preserve">They do not begin with</w:t>
+      </w:r>
+      <w:r>
+        <w:t xml:space="preserve"> </w:t>
+      </w:r>
+      <w:r>
+        <w:rPr>
+          <w:rStyle w:val="VerbatimChar"/>
+        </w:rPr>
+        <w:t xml:space="preserve">@</w:t>
+      </w:r>
+      <w:r>
+        <w:t xml:space="preserve">, so they are not SIP shortcut strings. They are better described as</w:t>
+      </w:r>
+      <w:r>
+        <w:t xml:space="preserve"> </w:t>
+      </w:r>
+      <w:r>
+        <w:rPr>
+          <w:b/>
+          <w:bCs/>
+        </w:rPr>
+        <w:t xml:space="preserve">domain-based discovery aliases</w:t>
+      </w:r>
+      <w:r>
+        <w:t xml:space="preserve"> </w:t>
+      </w:r>
+      <w:r>
+        <w:t xml:space="preserve">or</w:t>
+      </w:r>
+      <w:r>
+        <w:t xml:space="preserve"> </w:t>
+      </w:r>
+      <w:r>
+        <w:rPr>
+          <w:b/>
+          <w:bCs/>
+        </w:rPr>
+        <w:t xml:space="preserve">web entry points into SIP resolution</w:t>
+      </w:r>
+      <w:r>
+        <w:t xml:space="preserve">.</w:t>
+      </w:r>
+    </w:p>
+    <w:p>
+      <w:pPr>
+        <w:pStyle w:val="BodyText"/>
+      </w:pPr>
+      <w:r>
+        <w:t xml:space="preserve">A domain alias can point into SIP, but it is not itself the SIP identity.</w:t>
+      </w:r>
+    </w:p>
+    <w:p>
+      <w:pPr>
+        <w:pStyle w:val="BodyText"/>
+      </w:pPr>
+      <w:r>
+        <w:t xml:space="preserve">Example resolution chain:</w:t>
+      </w:r>
+    </w:p>
+    <w:p>
+      <w:pPr>
+        <w:pStyle w:val="SourceCode"/>
+      </w:pPr>
+      <w:r>
+        <w:rPr>
+          <w:rStyle w:val="VerbatimChar"/>
+        </w:rPr>
+        <w:t xml:space="preserve">lasca.stackworks.games</w:t>
+      </w:r>
+      <w:r>
+        <w:br/>
+      </w:r>
+      <w:r>
+        <w:rPr>
+          <w:rStyle w:val="VerbatimChar"/>
+        </w:rPr>
+        <w:t xml:space="preserve">        ↓</w:t>
+      </w:r>
+      <w:r>
+        <w:br/>
+      </w:r>
+      <w:r>
+        <w:rPr>
+          <w:rStyle w:val="VerbatimChar"/>
+        </w:rPr>
+        <w:t xml:space="preserve">@stackworks/lasca</w:t>
+      </w:r>
+      <w:r>
+        <w:br/>
+      </w:r>
+      <w:r>
+        <w:rPr>
+          <w:rStyle w:val="VerbatimChar"/>
+        </w:rPr>
+        <w:t xml:space="preserve">        ↓</w:t>
+      </w:r>
+      <w:r>
+        <w:br/>
+      </w:r>
+      <w:r>
+        <w:rPr>
+          <w:rStyle w:val="VerbatimChar"/>
+        </w:rPr>
+        <w:t xml:space="preserve">@owner/edbecnel/stackworks/games/strategy/abstract/capture/leaping/stacking/lasca</w:t>
+      </w:r>
+    </w:p>
+    <w:p>
+      <w:pPr>
+        <w:pStyle w:val="FirstParagraph"/>
+      </w:pPr>
+      <w:r>
+        <w:t xml:space="preserve">The domain name serves as a familiar web-facing bridge. The SIP string remains the actual SIP identity layer.</w:t>
+      </w:r>
+    </w:p>
+    <w:p>
+      <w:r>
+        <w:pict>
+          <v:rect style="width:0;height:1.5pt" o:hralign="center" o:hrstd="t" o:hr="t"/>
+        </w:pict>
+      </w:r>
+    </w:p>
+    <w:bookmarkEnd w:id="233"/>
+    <w:bookmarkEnd w:id="234"/>
+    <w:bookmarkStart w:id="235" w:name="sip-strings-begin-with"/>
+    <w:p>
+      <w:pPr>
+        <w:pStyle w:val="Heading2"/>
+      </w:pPr>
+      <w:r>
+        <w:t xml:space="preserve">SIP Strings Begin with @</w:t>
+      </w:r>
+    </w:p>
+    <w:p>
+      <w:pPr>
+        <w:pStyle w:val="FirstParagraph"/>
+      </w:pPr>
+      <w:r>
+        <w:t xml:space="preserve">A core convention for SIP is:</w:t>
+      </w:r>
+    </w:p>
+    <w:p>
+      <w:pPr>
+        <w:pStyle w:val="SourceCode"/>
+      </w:pPr>
+      <w:r>
+        <w:rPr>
+          <w:rStyle w:val="VerbatimChar"/>
+        </w:rPr>
+        <w:t xml:space="preserve">SIP strings begin with @.</w:t>
+      </w:r>
+      <w:r>
+        <w:br/>
+      </w:r>
+      <w:r>
+        <w:rPr>
+          <w:rStyle w:val="VerbatimChar"/>
+        </w:rPr>
+        <w:t xml:space="preserve">Domain aliases do not.</w:t>
+      </w:r>
+    </w:p>
+    <w:p>
+      <w:pPr>
+        <w:pStyle w:val="FirstParagraph"/>
+      </w:pPr>
+      <w:r>
+        <w:t xml:space="preserve">A URI wrapper such as</w:t>
+      </w:r>
+      <w:r>
+        <w:t xml:space="preserve"> </w:t>
+      </w:r>
+      <w:r>
+        <w:rPr>
+          <w:rStyle w:val="VerbatimChar"/>
+        </w:rPr>
+        <w:t xml:space="preserve">sip:stackworks.games/lasca</w:t>
+      </w:r>
+      <w:r>
+        <w:t xml:space="preserve"> </w:t>
+      </w:r>
+      <w:r>
+        <w:t xml:space="preserve">should generally be avoided because</w:t>
+      </w:r>
+      <w:r>
+        <w:t xml:space="preserve"> </w:t>
+      </w:r>
+      <w:r>
+        <w:rPr>
+          <w:rStyle w:val="VerbatimChar"/>
+        </w:rPr>
+        <w:t xml:space="preserve">sip:</w:t>
+      </w:r>
+      <w:r>
+        <w:t xml:space="preserve"> </w:t>
+      </w:r>
+      <w:r>
+        <w:t xml:space="preserve">is already strongly associated with the existing internet telephony Session Initiation Protocol. If a URI wrapper is needed, alternatives such as</w:t>
+      </w:r>
+      <w:r>
+        <w:t xml:space="preserve"> </w:t>
+      </w:r>
+      <w:r>
+        <w:rPr>
+          <w:rStyle w:val="VerbatimChar"/>
+        </w:rPr>
+        <w:t xml:space="preserve">sipi:</w:t>
+      </w:r>
+      <w:r>
+        <w:t xml:space="preserve"> </w:t>
+      </w:r>
+      <w:r>
+        <w:t xml:space="preserve">or</w:t>
+      </w:r>
+      <w:r>
+        <w:t xml:space="preserve"> </w:t>
+      </w:r>
+      <w:r>
+        <w:rPr>
+          <w:rStyle w:val="VerbatimChar"/>
+        </w:rPr>
+        <w:t xml:space="preserve">sid:</w:t>
+      </w:r>
+      <w:r>
+        <w:t xml:space="preserve"> </w:t>
+      </w:r>
+      <w:r>
+        <w:t xml:space="preserve">may be considered. However, the cleanest primary rule remains that SIP strings begin with</w:t>
+      </w:r>
+      <w:r>
+        <w:t xml:space="preserve"> </w:t>
+      </w:r>
+      <w:r>
+        <w:rPr>
+          <w:rStyle w:val="VerbatimChar"/>
+        </w:rPr>
+        <w:t xml:space="preserve">@</w:t>
+      </w:r>
+      <w:r>
+        <w:t xml:space="preserve"> </w:t>
+      </w:r>
+      <w:r>
+        <w:t xml:space="preserve">and domain aliases do not.</w:t>
+      </w:r>
+    </w:p>
+    <w:p>
+      <w:r>
+        <w:pict>
+          <v:rect style="width:0;height:1.5pt" o:hralign="center" o:hrstd="t" o:hr="t"/>
+        </w:pict>
+      </w:r>
+    </w:p>
+    <w:bookmarkEnd w:id="235"/>
+    <w:bookmarkStart w:id="239" w:name="three-kinds-of-sip-shortcuts"/>
+    <w:p>
+      <w:pPr>
+        <w:pStyle w:val="Heading2"/>
+      </w:pPr>
+      <w:r>
+        <w:t xml:space="preserve">Three Kinds of SIP Shortcuts</w:t>
+      </w:r>
+    </w:p>
+    <w:p>
+      <w:pPr>
+        <w:pStyle w:val="FirstParagraph"/>
+      </w:pPr>
+      <w:r>
+        <w:t xml:space="preserve">SIP formally distinguishes at least three shortcut types:</w:t>
+      </w:r>
+    </w:p>
+    <w:bookmarkStart w:id="236" w:name="global-semantic-shortcuts"/>
+    <w:p>
+      <w:pPr>
+        <w:pStyle w:val="Heading3"/>
+      </w:pPr>
+      <w:r>
+        <w:t xml:space="preserve">Global Semantic Shortcuts</w:t>
+      </w:r>
+    </w:p>
+    <w:p>
+      <w:pPr>
+        <w:pStyle w:val="FirstParagraph"/>
+      </w:pPr>
+      <w:r>
+        <w:t xml:space="preserve">Global semantic shortcuts are public, owner-neutral shortcuts.</w:t>
+      </w:r>
+    </w:p>
+    <w:p>
+      <w:pPr>
+        <w:pStyle w:val="BodyText"/>
+      </w:pPr>
+      <w:r>
+        <w:t xml:space="preserve">Examples:</w:t>
+      </w:r>
+    </w:p>
+    <w:p>
+      <w:pPr>
+        <w:pStyle w:val="SourceCode"/>
+      </w:pPr>
+      <w:r>
+        <w:rPr>
+          <w:rStyle w:val="VerbatimChar"/>
+        </w:rPr>
+        <w:t xml:space="preserve">@games/lasca</w:t>
+      </w:r>
+      <w:r>
+        <w:br/>
+      </w:r>
+      <w:r>
+        <w:rPr>
+          <w:rStyle w:val="VerbatimChar"/>
+        </w:rPr>
+        <w:t xml:space="preserve">@games/chess</w:t>
+      </w:r>
+      <w:r>
+        <w:br/>
+      </w:r>
+      <w:r>
+        <w:rPr>
+          <w:rStyle w:val="VerbatimChar"/>
+        </w:rPr>
+        <w:t xml:space="preserve">@games/checkers</w:t>
+      </w:r>
+      <w:r>
+        <w:br/>
+      </w:r>
+      <w:r>
+        <w:rPr>
+          <w:rStyle w:val="VerbatimChar"/>
+        </w:rPr>
+        <w:t xml:space="preserve">@music/snare-drum</w:t>
+      </w:r>
+      <w:r>
+        <w:br/>
+      </w:r>
+      <w:r>
+        <w:rPr>
+          <w:rStyle w:val="VerbatimChar"/>
+        </w:rPr>
+        <w:t xml:space="preserve">@recipes/jambalaya</w:t>
+      </w:r>
+    </w:p>
+    <w:p>
+      <w:pPr>
+        <w:pStyle w:val="FirstParagraph"/>
+      </w:pPr>
+      <w:r>
+        <w:t xml:space="preserve">These resolve to semantic discovery paths, not directly to one owner.</w:t>
+      </w:r>
+    </w:p>
+    <w:p>
+      <w:pPr>
+        <w:pStyle w:val="BodyText"/>
+      </w:pPr>
+      <w:r>
+        <w:t xml:space="preserve">Example:</w:t>
+      </w:r>
+    </w:p>
+    <w:p>
+      <w:pPr>
+        <w:pStyle w:val="SourceCode"/>
+      </w:pPr>
+      <w:r>
+        <w:rPr>
+          <w:rStyle w:val="VerbatimChar"/>
+        </w:rPr>
+        <w:t xml:space="preserve">@games/lasca</w:t>
+      </w:r>
+      <w:r>
+        <w:br/>
+      </w:r>
+      <w:r>
+        <w:rPr>
+          <w:rStyle w:val="VerbatimChar"/>
+        </w:rPr>
+        <w:t xml:space="preserve">        ↓</w:t>
+      </w:r>
+      <w:r>
+        <w:br/>
+      </w:r>
+      <w:r>
+        <w:rPr>
+          <w:rStyle w:val="VerbatimChar"/>
+        </w:rPr>
+        <w:t xml:space="preserve">@games.strategy.abstract.capture.leaping.stacking.lasca</w:t>
+      </w:r>
+    </w:p>
+    <w:p>
+      <w:pPr>
+        <w:pStyle w:val="FirstParagraph"/>
+      </w:pPr>
+      <w:r>
+        <w:t xml:space="preserve">Global semantic shortcuts should be controlled by recognized namespace stewards or registry processes, not by private individuals or companies.</w:t>
+      </w:r>
+    </w:p>
+    <w:bookmarkEnd w:id="236"/>
+    <w:bookmarkStart w:id="237" w:name="owner-or-brand-shortcuts"/>
+    <w:p>
+      <w:pPr>
+        <w:pStyle w:val="Heading3"/>
+      </w:pPr>
+      <w:r>
+        <w:t xml:space="preserve">Owner or Brand Shortcuts</w:t>
+      </w:r>
+    </w:p>
+    <w:p>
+      <w:pPr>
+        <w:pStyle w:val="FirstParagraph"/>
+      </w:pPr>
+      <w:r>
+        <w:t xml:space="preserve">Owner or brand shortcuts are controlled by a verified owner, person, organization, project, or brand.</w:t>
+      </w:r>
+    </w:p>
+    <w:p>
+      <w:pPr>
+        <w:pStyle w:val="BodyText"/>
+      </w:pPr>
+      <w:r>
+        <w:t xml:space="preserve">Examples:</w:t>
+      </w:r>
+    </w:p>
+    <w:p>
+      <w:pPr>
+        <w:pStyle w:val="SourceCode"/>
+      </w:pPr>
+      <w:r>
+        <w:rPr>
+          <w:rStyle w:val="VerbatimChar"/>
+        </w:rPr>
+        <w:t xml:space="preserve">@stackworks/lasca</w:t>
+      </w:r>
+      <w:r>
+        <w:br/>
+      </w:r>
+      <w:r>
+        <w:rPr>
+          <w:rStyle w:val="VerbatimChar"/>
+        </w:rPr>
+        <w:t xml:space="preserve">@edbecnel/recipes/jambalaya</w:t>
+      </w:r>
+    </w:p>
+    <w:p>
+      <w:pPr>
+        <w:pStyle w:val="FirstParagraph"/>
+      </w:pPr>
+      <w:r>
+        <w:t xml:space="preserve">These resolve to owner-bound SIP identities.</w:t>
+      </w:r>
+    </w:p>
+    <w:p>
+      <w:pPr>
+        <w:pStyle w:val="BodyText"/>
+      </w:pPr>
+      <w:r>
+        <w:t xml:space="preserve">Example:</w:t>
+      </w:r>
+    </w:p>
+    <w:p>
+      <w:pPr>
+        <w:pStyle w:val="SourceCode"/>
+      </w:pPr>
+      <w:r>
+        <w:rPr>
+          <w:rStyle w:val="VerbatimChar"/>
+        </w:rPr>
+        <w:t xml:space="preserve">@stackworks/lasca</w:t>
+      </w:r>
+      <w:r>
+        <w:br/>
+      </w:r>
+      <w:r>
+        <w:rPr>
+          <w:rStyle w:val="VerbatimChar"/>
+        </w:rPr>
+        <w:t xml:space="preserve">        ↓</w:t>
+      </w:r>
+      <w:r>
+        <w:br/>
+      </w:r>
+      <w:r>
+        <w:rPr>
+          <w:rStyle w:val="VerbatimChar"/>
+        </w:rPr>
+        <w:t xml:space="preserve">@owner/edbecnel/stackworks/games/lasca</w:t>
+      </w:r>
+    </w:p>
+    <w:bookmarkEnd w:id="237"/>
+    <w:bookmarkStart w:id="238" w:name="local-or-private-shortcuts"/>
+    <w:p>
+      <w:pPr>
+        <w:pStyle w:val="Heading3"/>
+      </w:pPr>
+      <w:r>
+        <w:t xml:space="preserve">Local or Private Shortcuts</w:t>
+      </w:r>
+    </w:p>
+    <w:p>
+      <w:pPr>
+        <w:pStyle w:val="FirstParagraph"/>
+      </w:pPr>
+      <w:r>
+        <w:t xml:space="preserve">Local or private shortcuts are user-defined or organization-defined aliases.</w:t>
+      </w:r>
+    </w:p>
+    <w:p>
+      <w:pPr>
+        <w:pStyle w:val="BodyText"/>
+      </w:pPr>
+      <w:r>
+        <w:t xml:space="preserve">Examples:</w:t>
+      </w:r>
+    </w:p>
+    <w:p>
+      <w:pPr>
+        <w:pStyle w:val="SourceCode"/>
+      </w:pPr>
+      <w:r>
+        <w:rPr>
+          <w:rStyle w:val="VerbatimChar"/>
+        </w:rPr>
+        <w:t xml:space="preserve">@my/lasca</w:t>
+      </w:r>
+      <w:r>
+        <w:br/>
+      </w:r>
+      <w:r>
+        <w:rPr>
+          <w:rStyle w:val="VerbatimChar"/>
+        </w:rPr>
+        <w:t xml:space="preserve">@favorites/jambalaya</w:t>
+      </w:r>
+      <w:r>
+        <w:br/>
+      </w:r>
+      <w:r>
+        <w:rPr>
+          <w:rStyle w:val="VerbatimChar"/>
+        </w:rPr>
+        <w:t xml:space="preserve">@test/game1</w:t>
+      </w:r>
+    </w:p>
+    <w:p>
+      <w:pPr>
+        <w:pStyle w:val="FirstParagraph"/>
+      </w:pPr>
+      <w:r>
+        <w:t xml:space="preserve">These are useful inside a local workspace, application, or personal knowledge base. They are not globally authoritative unless registered through the global SIP shortcut system.</w:t>
+      </w:r>
+    </w:p>
+    <w:p>
+      <w:r>
+        <w:pict>
+          <v:rect style="width:0;height:1.5pt" o:hralign="center" o:hrstd="t" o:hr="t"/>
+        </w:pict>
+      </w:r>
+    </w:p>
+    <w:bookmarkEnd w:id="238"/>
+    <w:bookmarkEnd w:id="239"/>
+    <w:bookmarkStart w:id="240" w:name="global-sip-shortcut-registry"/>
+    <w:p>
+      <w:pPr>
+        <w:pStyle w:val="Heading2"/>
+      </w:pPr>
+      <w:r>
+        <w:t xml:space="preserve">Global SIP Shortcut Registry</w:t>
+      </w:r>
+    </w:p>
+    <w:p>
+      <w:pPr>
+        <w:pStyle w:val="FirstParagraph"/>
+      </w:pPr>
+      <w:r>
+        <w:t xml:space="preserve">SIP should define a formal registry layer called the</w:t>
+      </w:r>
+      <w:r>
+        <w:t xml:space="preserve"> </w:t>
+      </w:r>
+      <w:r>
+        <w:rPr>
+          <w:b/>
+          <w:bCs/>
+        </w:rPr>
+        <w:t xml:space="preserve">SIP Global Shortcut Registry</w:t>
+      </w:r>
+      <w:r>
+        <w:t xml:space="preserve">.</w:t>
+      </w:r>
+    </w:p>
+    <w:p>
+      <w:pPr>
+        <w:pStyle w:val="BodyText"/>
+      </w:pPr>
+      <w:r>
+        <w:t xml:space="preserve">This registry defines accepted shortcut paths such as:</w:t>
+      </w:r>
+    </w:p>
+    <w:p>
+      <w:pPr>
+        <w:pStyle w:val="SourceCode"/>
+      </w:pPr>
+      <w:r>
+        <w:rPr>
+          <w:rStyle w:val="VerbatimChar"/>
+        </w:rPr>
+        <w:t xml:space="preserve">@games/lasca</w:t>
+      </w:r>
+      <w:r>
+        <w:br/>
+      </w:r>
+      <w:r>
+        <w:rPr>
+          <w:rStyle w:val="VerbatimChar"/>
+        </w:rPr>
+        <w:t xml:space="preserve">@games/chess</w:t>
+      </w:r>
+      <w:r>
+        <w:br/>
+      </w:r>
+      <w:r>
+        <w:rPr>
+          <w:rStyle w:val="VerbatimChar"/>
+        </w:rPr>
+        <w:t xml:space="preserve">@games/checkers</w:t>
+      </w:r>
+      <w:r>
+        <w:br/>
+      </w:r>
+      <w:r>
+        <w:rPr>
+          <w:rStyle w:val="VerbatimChar"/>
+        </w:rPr>
+        <w:t xml:space="preserve">@music/snare-drum</w:t>
+      </w:r>
+      <w:r>
+        <w:br/>
+      </w:r>
+      <w:r>
+        <w:rPr>
+          <w:rStyle w:val="VerbatimChar"/>
+        </w:rPr>
+        <w:t xml:space="preserve">@recipes/jambalaya</w:t>
+      </w:r>
+    </w:p>
+    <w:p>
+      <w:pPr>
+        <w:pStyle w:val="FirstParagraph"/>
+      </w:pPr>
+      <w:r>
+        <w:t xml:space="preserve">Each shortcut is a signed registry entry, not merely a piece of text.</w:t>
+      </w:r>
+    </w:p>
+    <w:p>
+      <w:pPr>
+        <w:pStyle w:val="BodyText"/>
+      </w:pPr>
+      <w:r>
+        <w:t xml:space="preserve">Example registry record:</w:t>
+      </w:r>
+    </w:p>
+    <w:p>
+      <w:pPr>
+        <w:pStyle w:val="SourceCode"/>
+      </w:pPr>
+      <w:r>
+        <w:rPr>
+          <w:rStyle w:val="FunctionTok"/>
+        </w:rPr>
+        <w:t xml:space="preserve">{</w:t>
+      </w:r>
+      <w:r>
+        <w:br/>
+      </w:r>
+      <w:r>
+        <w:rPr>
+          <w:rStyle w:val="NormalTok"/>
+        </w:rPr>
+        <w:t xml:space="preserve">  </w:t>
+      </w:r>
+      <w:r>
+        <w:rPr>
+          <w:rStyle w:val="DataTypeTok"/>
+        </w:rPr>
+        <w:t xml:space="preserve">"shortcut"</w:t>
+      </w:r>
+      <w:r>
+        <w:rPr>
+          <w:rStyle w:val="FunctionTok"/>
+        </w:rPr>
+        <w:t xml:space="preserve">:</w:t>
+      </w:r>
+      <w:r>
+        <w:rPr>
+          <w:rStyle w:val="NormalTok"/>
+        </w:rPr>
+        <w:t xml:space="preserve"> </w:t>
+      </w:r>
+      <w:r>
+        <w:rPr>
+          <w:rStyle w:val="StringTok"/>
+        </w:rPr>
+        <w:t xml:space="preserve">"@games/lasca"</w:t>
+      </w:r>
+      <w:r>
+        <w:rPr>
+          <w:rStyle w:val="FunctionTok"/>
+        </w:rPr>
+        <w:t xml:space="preserve">,</w:t>
+      </w:r>
+      <w:r>
+        <w:br/>
+      </w:r>
+      <w:r>
+        <w:rPr>
+          <w:rStyle w:val="NormalTok"/>
+        </w:rPr>
+        <w:t xml:space="preserve">  </w:t>
+      </w:r>
+      <w:r>
+        <w:rPr>
+          <w:rStyle w:val="DataTypeTok"/>
+        </w:rPr>
+        <w:t xml:space="preserve">"resolvesTo"</w:t>
+      </w:r>
+      <w:r>
+        <w:rPr>
+          <w:rStyle w:val="FunctionTok"/>
+        </w:rPr>
+        <w:t xml:space="preserve">:</w:t>
+      </w:r>
+      <w:r>
+        <w:rPr>
+          <w:rStyle w:val="NormalTok"/>
+        </w:rPr>
+        <w:t xml:space="preserve"> </w:t>
+      </w:r>
+      <w:r>
+        <w:rPr>
+          <w:rStyle w:val="StringTok"/>
+        </w:rPr>
+        <w:t xml:space="preserve">"@games.strategy.abstract.capture.leaping.stacking.lasca"</w:t>
+      </w:r>
+      <w:r>
+        <w:rPr>
+          <w:rStyle w:val="FunctionTok"/>
+        </w:rPr>
+        <w:t xml:space="preserve">,</w:t>
+      </w:r>
+      <w:r>
+        <w:br/>
+      </w:r>
+      <w:r>
+        <w:rPr>
+          <w:rStyle w:val="NormalTok"/>
+        </w:rPr>
+        <w:t xml:space="preserve">  </w:t>
+      </w:r>
+      <w:r>
+        <w:rPr>
+          <w:rStyle w:val="DataTypeTok"/>
+        </w:rPr>
+        <w:t xml:space="preserve">"status"</w:t>
+      </w:r>
+      <w:r>
+        <w:rPr>
+          <w:rStyle w:val="FunctionTok"/>
+        </w:rPr>
+        <w:t xml:space="preserve">:</w:t>
+      </w:r>
+      <w:r>
+        <w:rPr>
+          <w:rStyle w:val="NormalTok"/>
+        </w:rPr>
+        <w:t xml:space="preserve"> </w:t>
+      </w:r>
+      <w:r>
+        <w:rPr>
+          <w:rStyle w:val="StringTok"/>
+        </w:rPr>
+        <w:t xml:space="preserve">"accepted"</w:t>
+      </w:r>
+      <w:r>
+        <w:rPr>
+          <w:rStyle w:val="FunctionTok"/>
+        </w:rPr>
+        <w:t xml:space="preserve">,</w:t>
+      </w:r>
+      <w:r>
+        <w:br/>
+      </w:r>
+      <w:r>
+        <w:rPr>
+          <w:rStyle w:val="NormalTok"/>
+        </w:rPr>
+        <w:t xml:space="preserve">  </w:t>
+      </w:r>
+      <w:r>
+        <w:rPr>
+          <w:rStyle w:val="DataTypeTok"/>
+        </w:rPr>
+        <w:t xml:space="preserve">"namespace"</w:t>
+      </w:r>
+      <w:r>
+        <w:rPr>
+          <w:rStyle w:val="FunctionTok"/>
+        </w:rPr>
+        <w:t xml:space="preserve">:</w:t>
+      </w:r>
+      <w:r>
+        <w:rPr>
+          <w:rStyle w:val="NormalTok"/>
+        </w:rPr>
+        <w:t xml:space="preserve"> </w:t>
+      </w:r>
+      <w:r>
+        <w:rPr>
+          <w:rStyle w:val="StringTok"/>
+        </w:rPr>
+        <w:t xml:space="preserve">"@games"</w:t>
+      </w:r>
+      <w:r>
+        <w:rPr>
+          <w:rStyle w:val="FunctionTok"/>
+        </w:rPr>
+        <w:t xml:space="preserve">,</w:t>
+      </w:r>
+      <w:r>
+        <w:br/>
+      </w:r>
+      <w:r>
+        <w:rPr>
+          <w:rStyle w:val="NormalTok"/>
+        </w:rPr>
+        <w:t xml:space="preserve">  </w:t>
+      </w:r>
+      <w:r>
+        <w:rPr>
+          <w:rStyle w:val="DataTypeTok"/>
+        </w:rPr>
+        <w:t xml:space="preserve">"type"</w:t>
+      </w:r>
+      <w:r>
+        <w:rPr>
+          <w:rStyle w:val="FunctionTok"/>
+        </w:rPr>
+        <w:t xml:space="preserve">:</w:t>
+      </w:r>
+      <w:r>
+        <w:rPr>
+          <w:rStyle w:val="NormalTok"/>
+        </w:rPr>
+        <w:t xml:space="preserve"> </w:t>
+      </w:r>
+      <w:r>
+        <w:rPr>
+          <w:rStyle w:val="StringTok"/>
+        </w:rPr>
+        <w:t xml:space="preserve">"semantic-discovery-shortcut"</w:t>
+      </w:r>
+      <w:r>
+        <w:rPr>
+          <w:rStyle w:val="FunctionTok"/>
+        </w:rPr>
+        <w:t xml:space="preserve">,</w:t>
+      </w:r>
+      <w:r>
+        <w:br/>
+      </w:r>
+      <w:r>
+        <w:rPr>
+          <w:rStyle w:val="NormalTok"/>
+        </w:rPr>
+        <w:t xml:space="preserve">  </w:t>
+      </w:r>
+      <w:r>
+        <w:rPr>
+          <w:rStyle w:val="DataTypeTok"/>
+        </w:rPr>
+        <w:t xml:space="preserve">"description"</w:t>
+      </w:r>
+      <w:r>
+        <w:rPr>
+          <w:rStyle w:val="FunctionTok"/>
+        </w:rPr>
+        <w:t xml:space="preserve">:</w:t>
+      </w:r>
+      <w:r>
+        <w:rPr>
+          <w:rStyle w:val="NormalTok"/>
+        </w:rPr>
+        <w:t xml:space="preserve"> </w:t>
+      </w:r>
+      <w:r>
+        <w:rPr>
+          <w:rStyle w:val="StringTok"/>
+        </w:rPr>
+        <w:t xml:space="preserve">"Lasca / Laska family of stacking capture board games"</w:t>
+      </w:r>
+      <w:r>
+        <w:rPr>
+          <w:rStyle w:val="FunctionTok"/>
+        </w:rPr>
+        <w:t xml:space="preserve">,</w:t>
+      </w:r>
+      <w:r>
+        <w:br/>
+      </w:r>
+      <w:r>
+        <w:rPr>
+          <w:rStyle w:val="NormalTok"/>
+        </w:rPr>
+        <w:t xml:space="preserve">  </w:t>
+      </w:r>
+      <w:r>
+        <w:rPr>
+          <w:rStyle w:val="DataTypeTok"/>
+        </w:rPr>
+        <w:t xml:space="preserve">"steward"</w:t>
+      </w:r>
+      <w:r>
+        <w:rPr>
+          <w:rStyle w:val="FunctionTok"/>
+        </w:rPr>
+        <w:t xml:space="preserve">:</w:t>
+      </w:r>
+      <w:r>
+        <w:rPr>
+          <w:rStyle w:val="NormalTok"/>
+        </w:rPr>
+        <w:t xml:space="preserve"> </w:t>
+      </w:r>
+      <w:r>
+        <w:rPr>
+          <w:rStyle w:val="StringTok"/>
+        </w:rPr>
+        <w:t xml:space="preserve">"SIP Games Namespace Registry"</w:t>
+      </w:r>
+      <w:r>
+        <w:rPr>
+          <w:rStyle w:val="FunctionTok"/>
+        </w:rPr>
+        <w:t xml:space="preserve">,</w:t>
+      </w:r>
+      <w:r>
+        <w:br/>
+      </w:r>
+      <w:r>
+        <w:rPr>
+          <w:rStyle w:val="NormalTok"/>
+        </w:rPr>
+        <w:t xml:space="preserve">  </w:t>
+      </w:r>
+      <w:r>
+        <w:rPr>
+          <w:rStyle w:val="DataTypeTok"/>
+        </w:rPr>
+        <w:t xml:space="preserve">"created"</w:t>
+      </w:r>
+      <w:r>
+        <w:rPr>
+          <w:rStyle w:val="FunctionTok"/>
+        </w:rPr>
+        <w:t xml:space="preserve">:</w:t>
+      </w:r>
+      <w:r>
+        <w:rPr>
+          <w:rStyle w:val="NormalTok"/>
+        </w:rPr>
+        <w:t xml:space="preserve"> </w:t>
+      </w:r>
+      <w:r>
+        <w:rPr>
+          <w:rStyle w:val="StringTok"/>
+        </w:rPr>
+        <w:t xml:space="preserve">"2026-06-01"</w:t>
+      </w:r>
+      <w:r>
+        <w:rPr>
+          <w:rStyle w:val="FunctionTok"/>
+        </w:rPr>
+        <w:t xml:space="preserve">,</w:t>
+      </w:r>
+      <w:r>
+        <w:br/>
+      </w:r>
+      <w:r>
+        <w:rPr>
+          <w:rStyle w:val="NormalTok"/>
+        </w:rPr>
+        <w:t xml:space="preserve">  </w:t>
+      </w:r>
+      <w:r>
+        <w:rPr>
+          <w:rStyle w:val="DataTypeTok"/>
+        </w:rPr>
+        <w:t xml:space="preserve">"version"</w:t>
+      </w:r>
+      <w:r>
+        <w:rPr>
+          <w:rStyle w:val="FunctionTok"/>
+        </w:rPr>
+        <w:t xml:space="preserve">:</w:t>
+      </w:r>
+      <w:r>
+        <w:rPr>
+          <w:rStyle w:val="NormalTok"/>
+        </w:rPr>
+        <w:t xml:space="preserve"> </w:t>
+      </w:r>
+      <w:r>
+        <w:rPr>
+          <w:rStyle w:val="StringTok"/>
+        </w:rPr>
+        <w:t xml:space="preserve">"1.0"</w:t>
+      </w:r>
+      <w:r>
+        <w:rPr>
+          <w:rStyle w:val="FunctionTok"/>
+        </w:rPr>
+        <w:t xml:space="preserve">,</w:t>
+      </w:r>
+      <w:r>
+        <w:br/>
+      </w:r>
+      <w:r>
+        <w:rPr>
+          <w:rStyle w:val="NormalTok"/>
+        </w:rPr>
+        <w:t xml:space="preserve">  </w:t>
+      </w:r>
+      <w:r>
+        <w:rPr>
+          <w:rStyle w:val="DataTypeTok"/>
+        </w:rPr>
+        <w:t xml:space="preserve">"signature"</w:t>
+      </w:r>
+      <w:r>
+        <w:rPr>
+          <w:rStyle w:val="FunctionTok"/>
+        </w:rPr>
+        <w:t xml:space="preserve">:</w:t>
+      </w:r>
+      <w:r>
+        <w:rPr>
+          <w:rStyle w:val="NormalTok"/>
+        </w:rPr>
+        <w:t xml:space="preserve"> </w:t>
+      </w:r>
+      <w:r>
+        <w:rPr>
+          <w:rStyle w:val="StringTok"/>
+        </w:rPr>
+        <w:t xml:space="preserve">"..."</w:t>
+      </w:r>
+      <w:r>
+        <w:br/>
+      </w:r>
+      <w:r>
+        <w:rPr>
+          <w:rStyle w:val="FunctionTok"/>
+        </w:rPr>
+        <w:t xml:space="preserve">}</w:t>
+      </w:r>
+    </w:p>
+    <w:p>
+      <w:pPr>
+        <w:pStyle w:val="FirstParagraph"/>
+      </w:pPr>
+      <w:r>
+        <w:t xml:space="preserve">This makes the shortcut auditable, verifiable, and stable.</w:t>
+      </w:r>
+    </w:p>
+    <w:p>
+      <w:r>
+        <w:pict>
+          <v:rect style="width:0;height:1.5pt" o:hralign="center" o:hrstd="t" o:hr="t"/>
+        </w:pict>
+      </w:r>
+    </w:p>
+    <w:bookmarkEnd w:id="240"/>
+    <w:bookmarkStart w:id="241" w:name="namespace-stewardship"/>
+    <w:p>
+      <w:pPr>
+        <w:pStyle w:val="Heading2"/>
+      </w:pPr>
+      <w:r>
+        <w:t xml:space="preserve">Namespace Stewardship</w:t>
+      </w:r>
+    </w:p>
+    <w:p>
+      <w:pPr>
+        <w:pStyle w:val="FirstParagraph"/>
+      </w:pPr>
+      <w:r>
+        <w:t xml:space="preserve">Major public semantic namespaces should be managed by recognized namespace stewards or working groups rather than private individuals or companies.</w:t>
+      </w:r>
+    </w:p>
+    <w:p>
+      <w:pPr>
+        <w:pStyle w:val="BodyText"/>
+      </w:pPr>
+      <w:r>
+        <w:t xml:space="preserve">Examples of public namespaces and their stewardship model:</w:t>
+      </w:r>
+    </w:p>
+    <w:p>
+      <w:pPr>
+        <w:pStyle w:val="SourceCode"/>
+      </w:pPr>
+      <w:r>
+        <w:rPr>
+          <w:rStyle w:val="VerbatimChar"/>
+        </w:rPr>
+        <w:t xml:space="preserve">@games     →  SIP Games Namespace Registry</w:t>
+      </w:r>
+      <w:r>
+        <w:br/>
+      </w:r>
+      <w:r>
+        <w:rPr>
+          <w:rStyle w:val="VerbatimChar"/>
+        </w:rPr>
+        <w:t xml:space="preserve">@music     →  SIP Music Namespace Registry</w:t>
+      </w:r>
+      <w:r>
+        <w:br/>
+      </w:r>
+      <w:r>
+        <w:rPr>
+          <w:rStyle w:val="VerbatimChar"/>
+        </w:rPr>
+        <w:t xml:space="preserve">@recipes   →  SIP Recipes Namespace Registry</w:t>
+      </w:r>
+      <w:r>
+        <w:br/>
+      </w:r>
+      <w:r>
+        <w:rPr>
+          <w:rStyle w:val="VerbatimChar"/>
+        </w:rPr>
+        <w:t xml:space="preserve">@books     →  SIP Books Namespace Registry</w:t>
+      </w:r>
+      <w:r>
+        <w:br/>
+      </w:r>
+      <w:r>
+        <w:rPr>
+          <w:rStyle w:val="VerbatimChar"/>
+        </w:rPr>
+        <w:t xml:space="preserve">@software  →  SIP Software Namespace Registry</w:t>
+      </w:r>
+      <w:r>
+        <w:br/>
+      </w:r>
+      <w:r>
+        <w:rPr>
+          <w:rStyle w:val="VerbatimChar"/>
+        </w:rPr>
+        <w:t xml:space="preserve">@people    →  SIP People Namespace Registry</w:t>
+      </w:r>
+      <w:r>
+        <w:br/>
+      </w:r>
+      <w:r>
+        <w:rPr>
+          <w:rStyle w:val="VerbatimChar"/>
+        </w:rPr>
+        <w:t xml:space="preserve">@places    →  SIP Places Namespace Registry</w:t>
+      </w:r>
+      <w:r>
+        <w:br/>
+      </w:r>
+      <w:r>
+        <w:rPr>
+          <w:rStyle w:val="VerbatimChar"/>
+        </w:rPr>
+        <w:t xml:space="preserve">@products  →  SIP Products Namespace Registry</w:t>
+      </w:r>
+    </w:p>
+    <w:p>
+      <w:pPr>
+        <w:pStyle w:val="FirstParagraph"/>
+      </w:pPr>
+      <w:r>
+        <w:t xml:space="preserve">The</w:t>
+      </w:r>
+      <w:r>
+        <w:t xml:space="preserve"> </w:t>
+      </w:r>
+      <w:r>
+        <w:rPr>
+          <w:rStyle w:val="VerbatimChar"/>
+        </w:rPr>
+        <w:t xml:space="preserve">@games</w:t>
+      </w:r>
+      <w:r>
+        <w:t xml:space="preserve"> </w:t>
+      </w:r>
+      <w:r>
+        <w:t xml:space="preserve">namespace steward would be responsible for reviewing and approving global shortcuts inside that namespace. Therefore</w:t>
+      </w:r>
+      <w:r>
+        <w:t xml:space="preserve"> </w:t>
+      </w:r>
+      <w:r>
+        <w:rPr>
+          <w:rStyle w:val="VerbatimChar"/>
+        </w:rPr>
+        <w:t xml:space="preserve">@games/lasca</w:t>
+      </w:r>
+      <w:r>
+        <w:t xml:space="preserve"> </w:t>
+      </w:r>
+      <w:r>
+        <w:t xml:space="preserve">would be approved by the</w:t>
+      </w:r>
+      <w:r>
+        <w:t xml:space="preserve"> </w:t>
+      </w:r>
+      <w:r>
+        <w:rPr>
+          <w:rStyle w:val="VerbatimChar"/>
+        </w:rPr>
+        <w:t xml:space="preserve">@games</w:t>
+      </w:r>
+      <w:r>
+        <w:t xml:space="preserve"> </w:t>
+      </w:r>
+      <w:r>
+        <w:t xml:space="preserve">namespace authority.</w:t>
+      </w:r>
+    </w:p>
+    <w:p>
+      <w:pPr>
+        <w:pStyle w:val="BodyText"/>
+      </w:pPr>
+      <w:r>
+        <w:t xml:space="preserve">By contrast,</w:t>
+      </w:r>
+      <w:r>
+        <w:t xml:space="preserve"> </w:t>
+      </w:r>
+      <w:r>
+        <w:rPr>
+          <w:rStyle w:val="VerbatimChar"/>
+        </w:rPr>
+        <w:t xml:space="preserve">@stackworks/lasca</w:t>
+      </w:r>
+      <w:r>
+        <w:t xml:space="preserve"> </w:t>
+      </w:r>
+      <w:r>
+        <w:t xml:space="preserve">would be controlled by StackWorks. Those are different authority models.</w:t>
+      </w:r>
+    </w:p>
+    <w:p>
+      <w:r>
+        <w:pict>
+          <v:rect style="width:0;height:1.5pt" o:hralign="center" o:hrstd="t" o:hr="t"/>
+        </w:pict>
+      </w:r>
+    </w:p>
+    <w:bookmarkEnd w:id="241"/>
+    <w:bookmarkStart w:id="242" w:name="first-use-should-not-automatically-win"/>
+    <w:p>
+      <w:pPr>
+        <w:pStyle w:val="Heading2"/>
+      </w:pPr>
+      <w:r>
+        <w:t xml:space="preserve">First Use Should Not Automatically Win</w:t>
+      </w:r>
+    </w:p>
+    <w:p>
+      <w:pPr>
+        <w:pStyle w:val="FirstParagraph"/>
+      </w:pPr>
+      <w:r>
+        <w:t xml:space="preserve">SIP should avoid domain-name-style squatting.</w:t>
+      </w:r>
+    </w:p>
+    <w:p>
+      <w:pPr>
+        <w:pStyle w:val="BodyText"/>
+      </w:pPr>
+      <w:r>
+        <w:t xml:space="preserve">If someone attempts to register</w:t>
+      </w:r>
+      <w:r>
+        <w:t xml:space="preserve"> </w:t>
+      </w:r>
+      <w:r>
+        <w:rPr>
+          <w:rStyle w:val="VerbatimChar"/>
+        </w:rPr>
+        <w:t xml:space="preserve">@games/chess</w:t>
+      </w:r>
+      <w:r>
+        <w:t xml:space="preserve">, that person should not own the public semantic concept of chess. They may own something like</w:t>
+      </w:r>
+      <w:r>
+        <w:t xml:space="preserve"> </w:t>
+      </w:r>
+      <w:r>
+        <w:rPr>
+          <w:rStyle w:val="VerbatimChar"/>
+        </w:rPr>
+        <w:t xml:space="preserve">@somecompany/chess</w:t>
+      </w:r>
+      <w:r>
+        <w:t xml:space="preserve"> </w:t>
+      </w:r>
+      <w:r>
+        <w:t xml:space="preserve">or</w:t>
+      </w:r>
+      <w:r>
+        <w:t xml:space="preserve"> </w:t>
+      </w:r>
+      <w:r>
+        <w:rPr>
+          <w:rStyle w:val="VerbatimChar"/>
+        </w:rPr>
+        <w:t xml:space="preserve">@owner/somecompany/games/chess</w:t>
+      </w:r>
+      <w:r>
+        <w:t xml:space="preserve">.</w:t>
+      </w:r>
+    </w:p>
+    <w:p>
+      <w:pPr>
+        <w:pStyle w:val="BodyText"/>
+      </w:pPr>
+      <w:r>
+        <w:t xml:space="preserve">But the global semantic shortcut</w:t>
+      </w:r>
+      <w:r>
+        <w:t xml:space="preserve"> </w:t>
+      </w:r>
+      <w:r>
+        <w:rPr>
+          <w:rStyle w:val="VerbatimChar"/>
+        </w:rPr>
+        <w:t xml:space="preserve">@games/chess</w:t>
+      </w:r>
+      <w:r>
+        <w:t xml:space="preserve"> </w:t>
+      </w:r>
+      <w:r>
+        <w:t xml:space="preserve">should be treated as a public controlled vocabulary entry, not private property.</w:t>
+      </w:r>
+    </w:p>
+    <w:p>
+      <w:pPr>
+        <w:pStyle w:val="BodyText"/>
+      </w:pPr>
+      <w:r>
+        <w:t xml:space="preserve">Global semantic shortcuts should not be allocated by simple first-come, first-served registration.</w:t>
+      </w:r>
+    </w:p>
+    <w:p>
+      <w:r>
+        <w:pict>
+          <v:rect style="width:0;height:1.5pt" o:hralign="center" o:hrstd="t" o:hr="t"/>
+        </w:pict>
+      </w:r>
+    </w:p>
+    <w:bookmarkEnd w:id="242"/>
+    <w:bookmarkStart w:id="243" w:name="acceptance-process-for-global-shortcuts"/>
+    <w:p>
+      <w:pPr>
+        <w:pStyle w:val="Heading2"/>
+      </w:pPr>
+      <w:r>
+        <w:t xml:space="preserve">Acceptance Process for Global Shortcuts</w:t>
+      </w:r>
+    </w:p>
+    <w:p>
+      <w:pPr>
+        <w:pStyle w:val="FirstParagraph"/>
+      </w:pPr>
+      <w:r>
+        <w:t xml:space="preserve">A global SIP shortcut should go through a process similar to the following:</w:t>
+      </w:r>
+    </w:p>
+    <w:p>
+      <w:pPr>
+        <w:pStyle w:val="SourceCode"/>
+      </w:pPr>
+      <w:r>
+        <w:rPr>
+          <w:rStyle w:val="VerbatimChar"/>
+        </w:rPr>
+        <w:t xml:space="preserve">1. Proposal</w:t>
+      </w:r>
+      <w:r>
+        <w:br/>
+      </w:r>
+      <w:r>
+        <w:rPr>
+          <w:rStyle w:val="VerbatimChar"/>
+        </w:rPr>
+        <w:t xml:space="preserve">2. Public review</w:t>
+      </w:r>
+      <w:r>
+        <w:br/>
+      </w:r>
+      <w:r>
+        <w:rPr>
+          <w:rStyle w:val="VerbatimChar"/>
+        </w:rPr>
+        <w:t xml:space="preserve">3. Conflict check</w:t>
+      </w:r>
+      <w:r>
+        <w:br/>
+      </w:r>
+      <w:r>
+        <w:rPr>
+          <w:rStyle w:val="VerbatimChar"/>
+        </w:rPr>
+        <w:t xml:space="preserve">4. Semantic path assignment</w:t>
+      </w:r>
+      <w:r>
+        <w:br/>
+      </w:r>
+      <w:r>
+        <w:rPr>
+          <w:rStyle w:val="VerbatimChar"/>
+        </w:rPr>
+        <w:t xml:space="preserve">5. Shortcut approval</w:t>
+      </w:r>
+      <w:r>
+        <w:br/>
+      </w:r>
+      <w:r>
+        <w:rPr>
+          <w:rStyle w:val="VerbatimChar"/>
+        </w:rPr>
+        <w:t xml:space="preserve">6. Signed registry publication</w:t>
+      </w:r>
+      <w:r>
+        <w:br/>
+      </w:r>
+      <w:r>
+        <w:rPr>
+          <w:rStyle w:val="VerbatimChar"/>
+        </w:rPr>
+        <w:t xml:space="preserve">7. Versioned updates over time</w:t>
+      </w:r>
+    </w:p>
+    <w:p>
+      <w:pPr>
+        <w:pStyle w:val="FirstParagraph"/>
+      </w:pPr>
+      <w:r>
+        <w:t xml:space="preserve">For example, a proposal for</w:t>
+      </w:r>
+      <w:r>
+        <w:t xml:space="preserve"> </w:t>
+      </w:r>
+      <w:r>
+        <w:rPr>
+          <w:rStyle w:val="VerbatimChar"/>
+        </w:rPr>
+        <w:t xml:space="preserve">@games/lasca</w:t>
+      </w:r>
+      <w:r>
+        <w:t xml:space="preserve"> </w:t>
+      </w:r>
+      <w:r>
+        <w:t xml:space="preserve">would trigger review of questions such as:</w:t>
+      </w:r>
+    </w:p>
+    <w:p>
+      <w:pPr>
+        <w:pStyle w:val="Compact"/>
+        <w:numPr>
+          <w:ilvl w:val="0"/>
+          <w:numId w:val="1152"/>
+        </w:numPr>
+      </w:pPr>
+      <w:r>
+        <w:t xml:space="preserve">Is</w:t>
+      </w:r>
+      <w:r>
+        <w:t xml:space="preserve"> </w:t>
+      </w:r>
+      <w:r>
+        <w:t xml:space="preserve">“Lasca”</w:t>
+      </w:r>
+      <w:r>
+        <w:t xml:space="preserve"> </w:t>
+      </w:r>
+      <w:r>
+        <w:t xml:space="preserve">the common name? Is it ambiguous?</w:t>
+      </w:r>
+    </w:p>
+    <w:p>
+      <w:pPr>
+        <w:pStyle w:val="Compact"/>
+        <w:numPr>
+          <w:ilvl w:val="0"/>
+          <w:numId w:val="1152"/>
+        </w:numPr>
+      </w:pPr>
+      <w:r>
+        <w:t xml:space="preserve">Does it conflict with another game, product, person, or brand?</w:t>
+      </w:r>
+    </w:p>
+    <w:p>
+      <w:pPr>
+        <w:pStyle w:val="Compact"/>
+        <w:numPr>
+          <w:ilvl w:val="0"/>
+          <w:numId w:val="1152"/>
+        </w:numPr>
+      </w:pPr>
+      <w:r>
+        <w:t xml:space="preserve">Should the shortcut be</w:t>
+      </w:r>
+      <w:r>
+        <w:t xml:space="preserve"> </w:t>
+      </w:r>
+      <w:r>
+        <w:rPr>
+          <w:rStyle w:val="VerbatimChar"/>
+        </w:rPr>
+        <w:t xml:space="preserve">@games/lasca</w:t>
+      </w:r>
+      <w:r>
+        <w:t xml:space="preserve"> </w:t>
+      </w:r>
+      <w:r>
+        <w:t xml:space="preserve">or</w:t>
+      </w:r>
+      <w:r>
+        <w:t xml:space="preserve"> </w:t>
+      </w:r>
+      <w:r>
+        <w:rPr>
+          <w:rStyle w:val="VerbatimChar"/>
+        </w:rPr>
+        <w:t xml:space="preserve">@games/laska</w:t>
+      </w:r>
+      <w:r>
+        <w:t xml:space="preserve">?</w:t>
+      </w:r>
+    </w:p>
+    <w:p>
+      <w:pPr>
+        <w:pStyle w:val="Compact"/>
+        <w:numPr>
+          <w:ilvl w:val="0"/>
+          <w:numId w:val="1152"/>
+        </w:numPr>
+      </w:pPr>
+      <w:r>
+        <w:t xml:space="preserve">What full discovery path should it resolve to?</w:t>
+      </w:r>
+    </w:p>
+    <w:p>
+      <w:pPr>
+        <w:pStyle w:val="Compact"/>
+        <w:numPr>
+          <w:ilvl w:val="0"/>
+          <w:numId w:val="1152"/>
+        </w:numPr>
+      </w:pPr>
+      <w:r>
+        <w:t xml:space="preserve">Are there known synonyms?</w:t>
+      </w:r>
+    </w:p>
+    <w:p>
+      <w:pPr>
+        <w:pStyle w:val="FirstParagraph"/>
+      </w:pPr>
+      <w:r>
+        <w:t xml:space="preserve">The registry may then approve:</w:t>
+      </w:r>
+    </w:p>
+    <w:p>
+      <w:pPr>
+        <w:pStyle w:val="SourceCode"/>
+      </w:pPr>
+      <w:r>
+        <w:rPr>
+          <w:rStyle w:val="VerbatimChar"/>
+        </w:rPr>
+        <w:t xml:space="preserve">@games/lasca  →  @games.strategy.abstract.capture.leaping.stacking.lasca</w:t>
+      </w:r>
+    </w:p>
+    <w:p>
+      <w:pPr>
+        <w:pStyle w:val="FirstParagraph"/>
+      </w:pPr>
+      <w:r>
+        <w:t xml:space="preserve">It may also approve synonyms:</w:t>
+      </w:r>
+    </w:p>
+    <w:p>
+      <w:pPr>
+        <w:pStyle w:val="SourceCode"/>
+      </w:pPr>
+      <w:r>
+        <w:rPr>
+          <w:rStyle w:val="VerbatimChar"/>
+        </w:rPr>
+        <w:t xml:space="preserve">@games/laska  →  @games.strategy.abstract.capture.leaping.stacking.lasca</w:t>
+      </w:r>
+    </w:p>
+    <w:p>
+      <w:pPr>
+        <w:pStyle w:val="FirstParagraph"/>
+      </w:pPr>
+      <w:r>
+        <w:t xml:space="preserve">This gives SIP a stable, curated, globally meaningful shortcut system.</w:t>
+      </w:r>
+    </w:p>
+    <w:p>
+      <w:r>
+        <w:pict>
+          <v:rect style="width:0;height:1.5pt" o:hralign="center" o:hrstd="t" o:hr="t"/>
+        </w:pict>
+      </w:r>
+    </w:p>
+    <w:bookmarkEnd w:id="243"/>
+    <w:bookmarkStart w:id="244" w:name="signed-registry-entries"/>
+    <w:p>
+      <w:pPr>
+        <w:pStyle w:val="Heading2"/>
+      </w:pPr>
+      <w:r>
+        <w:t xml:space="preserve">Signed Registry Entries</w:t>
+      </w:r>
+    </w:p>
+    <w:p>
+      <w:pPr>
+        <w:pStyle w:val="FirstParagraph"/>
+      </w:pPr>
+      <w:r>
+        <w:t xml:space="preserve">A shortcut should not be trusted merely because it appears in text. It must be backed by a signed registry entry.</w:t>
+      </w:r>
+    </w:p>
+    <w:p>
+      <w:pPr>
+        <w:pStyle w:val="BodyText"/>
+      </w:pPr>
+      <w:r>
+        <w:t xml:space="preserve">A signed shortcut record should include:</w:t>
+      </w:r>
+    </w:p>
+    <w:p>
+      <w:pPr>
+        <w:pStyle w:val="SourceCode"/>
+      </w:pPr>
+      <w:r>
+        <w:rPr>
+          <w:rStyle w:val="VerbatimChar"/>
+        </w:rPr>
+        <w:t xml:space="preserve">shortcut</w:t>
+      </w:r>
+      <w:r>
+        <w:br/>
+      </w:r>
+      <w:r>
+        <w:rPr>
+          <w:rStyle w:val="VerbatimChar"/>
+        </w:rPr>
+        <w:t xml:space="preserve">canonical discovery path</w:t>
+      </w:r>
+      <w:r>
+        <w:br/>
+      </w:r>
+      <w:r>
+        <w:rPr>
+          <w:rStyle w:val="VerbatimChar"/>
+        </w:rPr>
+        <w:t xml:space="preserve">namespace</w:t>
+      </w:r>
+      <w:r>
+        <w:br/>
+      </w:r>
+      <w:r>
+        <w:rPr>
+          <w:rStyle w:val="VerbatimChar"/>
+        </w:rPr>
+        <w:t xml:space="preserve">status</w:t>
+      </w:r>
+      <w:r>
+        <w:br/>
+      </w:r>
+      <w:r>
+        <w:rPr>
+          <w:rStyle w:val="VerbatimChar"/>
+        </w:rPr>
+        <w:t xml:space="preserve">description</w:t>
+      </w:r>
+      <w:r>
+        <w:br/>
+      </w:r>
+      <w:r>
+        <w:rPr>
+          <w:rStyle w:val="VerbatimChar"/>
+        </w:rPr>
+        <w:t xml:space="preserve">steward</w:t>
+      </w:r>
+      <w:r>
+        <w:br/>
+      </w:r>
+      <w:r>
+        <w:rPr>
+          <w:rStyle w:val="VerbatimChar"/>
+        </w:rPr>
+        <w:t xml:space="preserve">version</w:t>
+      </w:r>
+      <w:r>
+        <w:br/>
+      </w:r>
+      <w:r>
+        <w:rPr>
+          <w:rStyle w:val="VerbatimChar"/>
+        </w:rPr>
+        <w:t xml:space="preserve">creation date</w:t>
+      </w:r>
+      <w:r>
+        <w:br/>
+      </w:r>
+      <w:r>
+        <w:rPr>
+          <w:rStyle w:val="VerbatimChar"/>
+        </w:rPr>
+        <w:t xml:space="preserve">signature</w:t>
+      </w:r>
+    </w:p>
+    <w:p>
+      <w:pPr>
+        <w:pStyle w:val="FirstParagraph"/>
+      </w:pPr>
+      <w:r>
+        <w:t xml:space="preserve">The signature ensures that a resolver can verify that the shortcut record came from the accepted namespace authority or registry.</w:t>
+      </w:r>
+    </w:p>
+    <w:p>
+      <w:r>
+        <w:pict>
+          <v:rect style="width:0;height:1.5pt" o:hralign="center" o:hrstd="t" o:hr="t"/>
+        </w:pict>
+      </w:r>
+    </w:p>
+    <w:bookmarkEnd w:id="244"/>
+    <w:bookmarkStart w:id="245" w:name="bootstrap-strategy"/>
+    <w:p>
+      <w:pPr>
+        <w:pStyle w:val="Heading2"/>
+      </w:pPr>
+      <w:r>
+        <w:t xml:space="preserve">Bootstrap Strategy</w:t>
+      </w:r>
+    </w:p>
+    <w:p>
+      <w:pPr>
+        <w:pStyle w:val="FirstParagraph"/>
+      </w:pPr>
+      <w:r>
+        <w:t xml:space="preserve">At first, SIP does not need a complex distributed registry. It could begin with a simple official registry file such as:</w:t>
+      </w:r>
+    </w:p>
+    <w:p>
+      <w:pPr>
+        <w:pStyle w:val="SourceCode"/>
+      </w:pPr>
+      <w:r>
+        <w:rPr>
+          <w:rStyle w:val="VerbatimChar"/>
+        </w:rPr>
+        <w:t xml:space="preserve">sip-shortcuts.json</w:t>
+      </w:r>
+    </w:p>
+    <w:p>
+      <w:pPr>
+        <w:pStyle w:val="FirstParagraph"/>
+      </w:pPr>
+      <w:r>
+        <w:t xml:space="preserve">or:</w:t>
+      </w:r>
+    </w:p>
+    <w:p>
+      <w:pPr>
+        <w:pStyle w:val="SourceCode"/>
+      </w:pPr>
+      <w:r>
+        <w:rPr>
+          <w:rStyle w:val="VerbatimChar"/>
+        </w:rPr>
+        <w:t xml:space="preserve">registry.sip/.well-known/global-shortcuts.json</w:t>
+      </w:r>
+    </w:p>
+    <w:p>
+      <w:pPr>
+        <w:pStyle w:val="FirstParagraph"/>
+      </w:pPr>
+      <w:r>
+        <w:t xml:space="preserve">The important requirements are that registry entries should be:</w:t>
+      </w:r>
+    </w:p>
+    <w:p>
+      <w:pPr>
+        <w:pStyle w:val="SourceCode"/>
+      </w:pPr>
+      <w:r>
+        <w:rPr>
+          <w:rStyle w:val="VerbatimChar"/>
+        </w:rPr>
+        <w:t xml:space="preserve">public</w:t>
+      </w:r>
+      <w:r>
+        <w:br/>
+      </w:r>
+      <w:r>
+        <w:rPr>
+          <w:rStyle w:val="VerbatimChar"/>
+        </w:rPr>
+        <w:t xml:space="preserve">versioned</w:t>
+      </w:r>
+      <w:r>
+        <w:br/>
+      </w:r>
+      <w:r>
+        <w:rPr>
+          <w:rStyle w:val="VerbatimChar"/>
+        </w:rPr>
+        <w:t xml:space="preserve">signed</w:t>
+      </w:r>
+      <w:r>
+        <w:br/>
+      </w:r>
+      <w:r>
+        <w:rPr>
+          <w:rStyle w:val="VerbatimChar"/>
+        </w:rPr>
+        <w:t xml:space="preserve">auditable</w:t>
+      </w:r>
+      <w:r>
+        <w:br/>
+      </w:r>
+      <w:r>
+        <w:rPr>
+          <w:rStyle w:val="VerbatimChar"/>
+        </w:rPr>
+        <w:t xml:space="preserve">not silently changeable</w:t>
+      </w:r>
+    </w:p>
+    <w:p>
+      <w:pPr>
+        <w:pStyle w:val="FirstParagraph"/>
+      </w:pPr>
+      <w:r>
+        <w:t xml:space="preserve">Over time, the registry could become distributed, mirrored, cryptographically signed, or governed by multiple independent stewards.</w:t>
+      </w:r>
+    </w:p>
+    <w:p>
+      <w:r>
+        <w:pict>
+          <v:rect style="width:0;height:1.5pt" o:hralign="center" o:hrstd="t" o:hr="t"/>
+        </w:pict>
+      </w:r>
+    </w:p>
+    <w:bookmarkEnd w:id="245"/>
+    <w:bookmarkStart w:id="246" w:name="domain-discovery-manifests"/>
+    <w:p>
+      <w:pPr>
+        <w:pStyle w:val="Heading2"/>
+      </w:pPr>
+      <w:r>
+        <w:t xml:space="preserve">Domain Discovery Manifests</w:t>
+      </w:r>
+    </w:p>
+    <w:p>
+      <w:pPr>
+        <w:pStyle w:val="FirstParagraph"/>
+      </w:pPr>
+      <w:r>
+        <w:t xml:space="preserve">Domain names can participate in SIP as discovery entry points.</w:t>
+      </w:r>
+    </w:p>
+    <w:p>
+      <w:pPr>
+        <w:pStyle w:val="BodyText"/>
+      </w:pPr>
+      <w:r>
+        <w:t xml:space="preserve">For example,</w:t>
+      </w:r>
+      <w:r>
+        <w:t xml:space="preserve"> </w:t>
+      </w:r>
+      <w:r>
+        <w:rPr>
+          <w:rStyle w:val="VerbatimChar"/>
+        </w:rPr>
+        <w:t xml:space="preserve">stackworks.games/lasca</w:t>
+      </w:r>
+      <w:r>
+        <w:t xml:space="preserve"> </w:t>
+      </w:r>
+      <w:r>
+        <w:t xml:space="preserve">could resolve to</w:t>
+      </w:r>
+      <w:r>
+        <w:t xml:space="preserve"> </w:t>
+      </w:r>
+      <w:r>
+        <w:rPr>
+          <w:rStyle w:val="VerbatimChar"/>
+        </w:rPr>
+        <w:t xml:space="preserve">@stackworks/lasca</w:t>
+      </w:r>
+      <w:r>
+        <w:t xml:space="preserve">, which then resolves to:</w:t>
+      </w:r>
+    </w:p>
+    <w:p>
+      <w:pPr>
+        <w:pStyle w:val="SourceCode"/>
+      </w:pPr>
+      <w:r>
+        <w:rPr>
+          <w:rStyle w:val="VerbatimChar"/>
+        </w:rPr>
+        <w:t xml:space="preserve">@owner/edbecnel/stackworks/games/lasca</w:t>
+      </w:r>
+    </w:p>
+    <w:p>
+      <w:pPr>
+        <w:pStyle w:val="FirstParagraph"/>
+      </w:pPr>
+      <w:r>
+        <w:t xml:space="preserve">A domain publishes a SIP manifest at a conventional metadata location:</w:t>
+      </w:r>
+    </w:p>
+    <w:p>
+      <w:pPr>
+        <w:pStyle w:val="SourceCode"/>
+      </w:pPr>
+      <w:r>
+        <w:rPr>
+          <w:rStyle w:val="VerbatimChar"/>
+        </w:rPr>
+        <w:t xml:space="preserve">https://stackworks.games/.well-known/sip.json</w:t>
+      </w:r>
+    </w:p>
+    <w:p>
+      <w:pPr>
+        <w:pStyle w:val="FirstParagraph"/>
+      </w:pPr>
+      <w:r>
+        <w:t xml:space="preserve">Example manifest:</w:t>
+      </w:r>
+    </w:p>
+    <w:p>
+      <w:pPr>
+        <w:pStyle w:val="SourceCode"/>
+      </w:pPr>
+      <w:r>
+        <w:rPr>
+          <w:rStyle w:val="FunctionTok"/>
+        </w:rPr>
+        <w:t xml:space="preserve">{</w:t>
+      </w:r>
+      <w:r>
+        <w:br/>
+      </w:r>
+      <w:r>
+        <w:rPr>
+          <w:rStyle w:val="NormalTok"/>
+        </w:rPr>
+        <w:t xml:space="preserve">  </w:t>
+      </w:r>
+      <w:r>
+        <w:rPr>
+          <w:rStyle w:val="DataTypeTok"/>
+        </w:rPr>
+        <w:t xml:space="preserve">"sipManifest"</w:t>
+      </w:r>
+      <w:r>
+        <w:rPr>
+          <w:rStyle w:val="FunctionTok"/>
+        </w:rPr>
+        <w:t xml:space="preserve">:</w:t>
+      </w:r>
+      <w:r>
+        <w:rPr>
+          <w:rStyle w:val="NormalTok"/>
+        </w:rPr>
+        <w:t xml:space="preserve"> </w:t>
+      </w:r>
+      <w:r>
+        <w:rPr>
+          <w:rStyle w:val="StringTok"/>
+        </w:rPr>
+        <w:t xml:space="preserve">"1.0"</w:t>
+      </w:r>
+      <w:r>
+        <w:rPr>
+          <w:rStyle w:val="FunctionTok"/>
+        </w:rPr>
+        <w:t xml:space="preserve">,</w:t>
+      </w:r>
+      <w:r>
+        <w:br/>
+      </w:r>
+      <w:r>
+        <w:rPr>
+          <w:rStyle w:val="NormalTok"/>
+        </w:rPr>
+        <w:t xml:space="preserve">  </w:t>
+      </w:r>
+      <w:r>
+        <w:rPr>
+          <w:rStyle w:val="DataTypeTok"/>
+        </w:rPr>
+        <w:t xml:space="preserve">"domain"</w:t>
+      </w:r>
+      <w:r>
+        <w:rPr>
+          <w:rStyle w:val="FunctionTok"/>
+        </w:rPr>
+        <w:t xml:space="preserve">:</w:t>
+      </w:r>
+      <w:r>
+        <w:rPr>
+          <w:rStyle w:val="NormalTok"/>
+        </w:rPr>
+        <w:t xml:space="preserve"> </w:t>
+      </w:r>
+      <w:r>
+        <w:rPr>
+          <w:rStyle w:val="StringTok"/>
+        </w:rPr>
+        <w:t xml:space="preserve">"stackworks.games"</w:t>
+      </w:r>
+      <w:r>
+        <w:rPr>
+          <w:rStyle w:val="FunctionTok"/>
+        </w:rPr>
+        <w:t xml:space="preserve">,</w:t>
+      </w:r>
+      <w:r>
+        <w:br/>
+      </w:r>
+      <w:r>
+        <w:rPr>
+          <w:rStyle w:val="NormalTok"/>
+        </w:rPr>
+        <w:t xml:space="preserve">  </w:t>
+      </w:r>
+      <w:r>
+        <w:rPr>
+          <w:rStyle w:val="DataTypeTok"/>
+        </w:rPr>
+        <w:t xml:space="preserve">"aliases"</w:t>
+      </w:r>
+      <w:r>
+        <w:rPr>
+          <w:rStyle w:val="FunctionTok"/>
+        </w:rPr>
+        <w:t xml:space="preserve">:</w:t>
+      </w:r>
+      <w:r>
+        <w:rPr>
+          <w:rStyle w:val="NormalTok"/>
+        </w:rPr>
+        <w:t xml:space="preserve"> </w:t>
+      </w:r>
+      <w:r>
+        <w:rPr>
+          <w:rStyle w:val="OtherTok"/>
+        </w:rPr>
+        <w:t xml:space="preserve">[</w:t>
+      </w:r>
+      <w:r>
+        <w:br/>
+      </w:r>
+      <w:r>
+        <w:rPr>
+          <w:rStyle w:val="NormalTok"/>
+        </w:rPr>
+        <w:t xml:space="preserve">    </w:t>
+      </w:r>
+      <w:r>
+        <w:rPr>
+          <w:rStyle w:val="FunctionTok"/>
+        </w:rPr>
+        <w:t xml:space="preserve">{</w:t>
+      </w:r>
+      <w:r>
+        <w:br/>
+      </w:r>
+      <w:r>
+        <w:rPr>
+          <w:rStyle w:val="NormalTok"/>
+        </w:rPr>
+        <w:t xml:space="preserve">      </w:t>
+      </w:r>
+      <w:r>
+        <w:rPr>
+          <w:rStyle w:val="DataTypeTok"/>
+        </w:rPr>
+        <w:t xml:space="preserve">"alias"</w:t>
+      </w:r>
+      <w:r>
+        <w:rPr>
+          <w:rStyle w:val="FunctionTok"/>
+        </w:rPr>
+        <w:t xml:space="preserve">:</w:t>
+      </w:r>
+      <w:r>
+        <w:rPr>
+          <w:rStyle w:val="NormalTok"/>
+        </w:rPr>
+        <w:t xml:space="preserve"> </w:t>
+      </w:r>
+      <w:r>
+        <w:rPr>
+          <w:rStyle w:val="StringTok"/>
+        </w:rPr>
+        <w:t xml:space="preserve">"@stackworks/lasca"</w:t>
+      </w:r>
+      <w:r>
+        <w:rPr>
+          <w:rStyle w:val="FunctionTok"/>
+        </w:rPr>
+        <w:t xml:space="preserve">,</w:t>
+      </w:r>
+      <w:r>
+        <w:br/>
+      </w:r>
+      <w:r>
+        <w:rPr>
+          <w:rStyle w:val="NormalTok"/>
+        </w:rPr>
+        <w:t xml:space="preserve">      </w:t>
+      </w:r>
+      <w:r>
+        <w:rPr>
+          <w:rStyle w:val="DataTypeTok"/>
+        </w:rPr>
+        <w:t xml:space="preserve">"canonical"</w:t>
+      </w:r>
+      <w:r>
+        <w:rPr>
+          <w:rStyle w:val="FunctionTok"/>
+        </w:rPr>
+        <w:t xml:space="preserve">:</w:t>
+      </w:r>
+      <w:r>
+        <w:rPr>
+          <w:rStyle w:val="NormalTok"/>
+        </w:rPr>
+        <w:t xml:space="preserve"> </w:t>
+      </w:r>
+      <w:r>
+        <w:rPr>
+          <w:rStyle w:val="StringTok"/>
+        </w:rPr>
+        <w:t xml:space="preserve">"@owner/edbecnel/stackworks/games/strategy/abstract/capture/leaping/stacking/lasca"</w:t>
+      </w:r>
+      <w:r>
+        <w:rPr>
+          <w:rStyle w:val="FunctionTok"/>
+        </w:rPr>
+        <w:t xml:space="preserve">,</w:t>
+      </w:r>
+      <w:r>
+        <w:br/>
+      </w:r>
+      <w:r>
+        <w:rPr>
+          <w:rStyle w:val="NormalTok"/>
+        </w:rPr>
+        <w:t xml:space="preserve">      </w:t>
+      </w:r>
+      <w:r>
+        <w:rPr>
+          <w:rStyle w:val="DataTypeTok"/>
+        </w:rPr>
+        <w:t xml:space="preserve">"title"</w:t>
+      </w:r>
+      <w:r>
+        <w:rPr>
+          <w:rStyle w:val="FunctionTok"/>
+        </w:rPr>
+        <w:t xml:space="preserve">:</w:t>
+      </w:r>
+      <w:r>
+        <w:rPr>
+          <w:rStyle w:val="NormalTok"/>
+        </w:rPr>
+        <w:t xml:space="preserve"> </w:t>
+      </w:r>
+      <w:r>
+        <w:rPr>
+          <w:rStyle w:val="StringTok"/>
+        </w:rPr>
+        <w:t xml:space="preserve">"Lasca"</w:t>
+      </w:r>
+      <w:r>
+        <w:rPr>
+          <w:rStyle w:val="FunctionTok"/>
+        </w:rPr>
+        <w:t xml:space="preserve">,</w:t>
+      </w:r>
+      <w:r>
+        <w:br/>
+      </w:r>
+      <w:r>
+        <w:rPr>
+          <w:rStyle w:val="NormalTok"/>
+        </w:rPr>
+        <w:t xml:space="preserve">      </w:t>
+      </w:r>
+      <w:r>
+        <w:rPr>
+          <w:rStyle w:val="DataTypeTok"/>
+        </w:rPr>
+        <w:t xml:space="preserve">"type"</w:t>
+      </w:r>
+      <w:r>
+        <w:rPr>
+          <w:rStyle w:val="FunctionTok"/>
+        </w:rPr>
+        <w:t xml:space="preserve">:</w:t>
+      </w:r>
+      <w:r>
+        <w:rPr>
+          <w:rStyle w:val="NormalTok"/>
+        </w:rPr>
+        <w:t xml:space="preserve"> </w:t>
+      </w:r>
+      <w:r>
+        <w:rPr>
+          <w:rStyle w:val="StringTok"/>
+        </w:rPr>
+        <w:t xml:space="preserve">"game.ruleset"</w:t>
+      </w:r>
+      <w:r>
+        <w:rPr>
+          <w:rStyle w:val="FunctionTok"/>
+        </w:rPr>
+        <w:t xml:space="preserve">,</w:t>
+      </w:r>
+      <w:r>
+        <w:br/>
+      </w:r>
+      <w:r>
+        <w:rPr>
+          <w:rStyle w:val="NormalTok"/>
+        </w:rPr>
+        <w:t xml:space="preserve">      </w:t>
+      </w:r>
+      <w:r>
+        <w:rPr>
+          <w:rStyle w:val="DataTypeTok"/>
+        </w:rPr>
+        <w:t xml:space="preserve">"fingerprint"</w:t>
+      </w:r>
+      <w:r>
+        <w:rPr>
+          <w:rStyle w:val="FunctionTok"/>
+        </w:rPr>
+        <w:t xml:space="preserve">:</w:t>
+      </w:r>
+      <w:r>
+        <w:rPr>
+          <w:rStyle w:val="NormalTok"/>
+        </w:rPr>
+        <w:t xml:space="preserve"> </w:t>
+      </w:r>
+      <w:r>
+        <w:rPr>
+          <w:rStyle w:val="StringTok"/>
+        </w:rPr>
+        <w:t xml:space="preserve">"7K3Q-9M2A"</w:t>
+      </w:r>
+      <w:r>
+        <w:br/>
+      </w:r>
+      <w:r>
+        <w:rPr>
+          <w:rStyle w:val="NormalTok"/>
+        </w:rPr>
+        <w:t xml:space="preserve">    </w:t>
+      </w:r>
+      <w:r>
+        <w:rPr>
+          <w:rStyle w:val="FunctionTok"/>
+        </w:rPr>
+        <w:t xml:space="preserve">}</w:t>
+      </w:r>
+      <w:r>
+        <w:br/>
+      </w:r>
+      <w:r>
+        <w:rPr>
+          <w:rStyle w:val="NormalTok"/>
+        </w:rPr>
+        <w:t xml:space="preserve">  </w:t>
+      </w:r>
+      <w:r>
+        <w:rPr>
+          <w:rStyle w:val="OtherTok"/>
+        </w:rPr>
+        <w:t xml:space="preserve">]</w:t>
+      </w:r>
+      <w:r>
+        <w:rPr>
+          <w:rStyle w:val="FunctionTok"/>
+        </w:rPr>
+        <w:t xml:space="preserve">,</w:t>
+      </w:r>
+      <w:r>
+        <w:br/>
+      </w:r>
+      <w:r>
+        <w:rPr>
+          <w:rStyle w:val="NormalTok"/>
+        </w:rPr>
+        <w:t xml:space="preserve">  </w:t>
+      </w:r>
+      <w:r>
+        <w:rPr>
+          <w:rStyle w:val="DataTypeTok"/>
+        </w:rPr>
+        <w:t xml:space="preserve">"signedBy"</w:t>
+      </w:r>
+      <w:r>
+        <w:rPr>
+          <w:rStyle w:val="FunctionTok"/>
+        </w:rPr>
+        <w:t xml:space="preserve">:</w:t>
+      </w:r>
+      <w:r>
+        <w:rPr>
+          <w:rStyle w:val="NormalTok"/>
+        </w:rPr>
+        <w:t xml:space="preserve"> </w:t>
+      </w:r>
+      <w:r>
+        <w:rPr>
+          <w:rStyle w:val="StringTok"/>
+        </w:rPr>
+        <w:t xml:space="preserve">"@owner/edbecnel"</w:t>
+      </w:r>
+      <w:r>
+        <w:rPr>
+          <w:rStyle w:val="FunctionTok"/>
+        </w:rPr>
+        <w:t xml:space="preserve">,</w:t>
+      </w:r>
+      <w:r>
+        <w:br/>
+      </w:r>
+      <w:r>
+        <w:rPr>
+          <w:rStyle w:val="NormalTok"/>
+        </w:rPr>
+        <w:t xml:space="preserve">  </w:t>
+      </w:r>
+      <w:r>
+        <w:rPr>
+          <w:rStyle w:val="DataTypeTok"/>
+        </w:rPr>
+        <w:t xml:space="preserve">"signature"</w:t>
+      </w:r>
+      <w:r>
+        <w:rPr>
+          <w:rStyle w:val="FunctionTok"/>
+        </w:rPr>
+        <w:t xml:space="preserve">:</w:t>
+      </w:r>
+      <w:r>
+        <w:rPr>
+          <w:rStyle w:val="NormalTok"/>
+        </w:rPr>
+        <w:t xml:space="preserve"> </w:t>
+      </w:r>
+      <w:r>
+        <w:rPr>
+          <w:rStyle w:val="StringTok"/>
+        </w:rPr>
+        <w:t xml:space="preserve">"..."</w:t>
+      </w:r>
+      <w:r>
+        <w:br/>
+      </w:r>
+      <w:r>
+        <w:rPr>
+          <w:rStyle w:val="FunctionTok"/>
+        </w:rPr>
+        <w:t xml:space="preserve">}</w:t>
+      </w:r>
+    </w:p>
+    <w:p>
+      <w:pPr>
+        <w:pStyle w:val="FirstParagraph"/>
+      </w:pPr>
+      <w:r>
+        <w:t xml:space="preserve">This lets ordinary domains participate in SIP without becoming the root identity. The domain is a doorway; the SIP identity remains the verified canonical record.</w:t>
+      </w:r>
+    </w:p>
+    <w:p>
+      <w:r>
+        <w:pict>
+          <v:rect style="width:0;height:1.5pt" o:hralign="center" o:hrstd="t" o:hr="t"/>
+        </w:pict>
+      </w:r>
+    </w:p>
+    <w:bookmarkEnd w:id="246"/>
+    <w:bookmarkStart w:id="247" w:name="recommended-user-facing-display"/>
+    <w:p>
+      <w:pPr>
+        <w:pStyle w:val="Heading2"/>
+      </w:pPr>
+      <w:r>
+        <w:t xml:space="preserve">Recommended User-Facing Display</w:t>
+      </w:r>
+    </w:p>
+    <w:p>
+      <w:pPr>
+        <w:pStyle w:val="FirstParagraph"/>
+      </w:pPr>
+      <w:r>
+        <w:t xml:space="preserve">Most users should not see the full canonical SIP string unless they expand details.</w:t>
+      </w:r>
+    </w:p>
+    <w:p>
+      <w:pPr>
+        <w:pStyle w:val="BodyText"/>
+      </w:pPr>
+      <w:r>
+        <w:t xml:space="preserve">A collapsed user interface might show:</w:t>
+      </w:r>
+    </w:p>
+    <w:p>
+      <w:pPr>
+        <w:pStyle w:val="SourceCode"/>
+      </w:pPr>
+      <w:r>
+        <w:rPr>
+          <w:rStyle w:val="VerbatimChar"/>
+        </w:rPr>
+        <w:t xml:space="preserve">Lasca</w:t>
+      </w:r>
+      <w:r>
+        <w:br/>
+      </w:r>
+      <w:r>
+        <w:rPr>
+          <w:rStyle w:val="VerbatimChar"/>
+        </w:rPr>
+        <w:t xml:space="preserve">Verified by StackWorks</w:t>
+      </w:r>
+      <w:r>
+        <w:br/>
+      </w:r>
+      <w:r>
+        <w:rPr>
+          <w:rStyle w:val="VerbatimChar"/>
+        </w:rPr>
+        <w:t xml:space="preserve">Shortcut: @stackworks/lasca</w:t>
+      </w:r>
+      <w:r>
+        <w:br/>
+      </w:r>
+      <w:r>
+        <w:rPr>
+          <w:rStyle w:val="VerbatimChar"/>
+        </w:rPr>
+        <w:t xml:space="preserve">Fingerprint: 7K3Q-9M2A</w:t>
+      </w:r>
+    </w:p>
+    <w:p>
+      <w:pPr>
+        <w:pStyle w:val="FirstParagraph"/>
+      </w:pPr>
+      <w:r>
+        <w:t xml:space="preserve">An expanded technical view might show:</w:t>
+      </w:r>
+    </w:p>
+    <w:p>
+      <w:pPr>
+        <w:pStyle w:val="SourceCode"/>
+      </w:pPr>
+      <w:r>
+        <w:rPr>
+          <w:rStyle w:val="VerbatimChar"/>
+        </w:rPr>
+        <w:t xml:space="preserve">Canonical SIP:</w:t>
+      </w:r>
+      <w:r>
+        <w:br/>
+      </w:r>
+      <w:r>
+        <w:rPr>
+          <w:rStyle w:val="VerbatimChar"/>
+        </w:rPr>
+        <w:t xml:space="preserve">@owner/edbecnel/stackworks/games/strategy/abstract/capture/leaping/stacking/lasca</w:t>
+      </w:r>
+      <w:r>
+        <w:br/>
+      </w:r>
+      <w:r>
+        <w:br/>
+      </w:r>
+      <w:r>
+        <w:rPr>
+          <w:rStyle w:val="VerbatimChar"/>
+        </w:rPr>
+        <w:t xml:space="preserve">Discovery Path:</w:t>
+      </w:r>
+      <w:r>
+        <w:br/>
+      </w:r>
+      <w:r>
+        <w:rPr>
+          <w:rStyle w:val="VerbatimChar"/>
+        </w:rPr>
+        <w:t xml:space="preserve">@games.strategy.abstract.capture.leaping.stacking.lasca</w:t>
+      </w:r>
+      <w:r>
+        <w:br/>
+      </w:r>
+      <w:r>
+        <w:br/>
+      </w:r>
+      <w:r>
+        <w:rPr>
+          <w:rStyle w:val="VerbatimChar"/>
+        </w:rPr>
+        <w:t xml:space="preserve">Global Shortcut:</w:t>
+      </w:r>
+      <w:r>
+        <w:br/>
+      </w:r>
+      <w:r>
+        <w:rPr>
+          <w:rStyle w:val="VerbatimChar"/>
+        </w:rPr>
+        <w:t xml:space="preserve">@games/lasca</w:t>
+      </w:r>
+      <w:r>
+        <w:br/>
+      </w:r>
+      <w:r>
+        <w:br/>
+      </w:r>
+      <w:r>
+        <w:rPr>
+          <w:rStyle w:val="VerbatimChar"/>
+        </w:rPr>
+        <w:t xml:space="preserve">Owner Shortcut:</w:t>
+      </w:r>
+      <w:r>
+        <w:br/>
+      </w:r>
+      <w:r>
+        <w:rPr>
+          <w:rStyle w:val="VerbatimChar"/>
+        </w:rPr>
+        <w:t xml:space="preserve">@stackworks/lasca</w:t>
+      </w:r>
+    </w:p>
+    <w:p>
+      <w:pPr>
+        <w:pStyle w:val="FirstParagraph"/>
+      </w:pPr>
+      <w:r>
+        <w:t xml:space="preserve">This keeps the everyday interface short while preserving full technical transparency.</w:t>
+      </w:r>
+    </w:p>
+    <w:p>
+      <w:r>
+        <w:pict>
+          <v:rect style="width:0;height:1.5pt" o:hralign="center" o:hrstd="t" o:hr="t"/>
+        </w:pict>
+      </w:r>
+    </w:p>
+    <w:bookmarkEnd w:id="247"/>
+    <w:bookmarkStart w:id="248" w:name="full-resolution-chain"/>
+    <w:p>
+      <w:pPr>
+        <w:pStyle w:val="Heading2"/>
+      </w:pPr>
+      <w:r>
+        <w:t xml:space="preserve">Full Resolution Chain</w:t>
+      </w:r>
+    </w:p>
+    <w:p>
+      <w:pPr>
+        <w:pStyle w:val="FirstParagraph"/>
+      </w:pPr>
+      <w:r>
+        <w:t xml:space="preserve">The complete Lasca resolution model:</w:t>
+      </w:r>
+    </w:p>
+    <w:p>
+      <w:pPr>
+        <w:pStyle w:val="SourceCode"/>
+      </w:pPr>
+      <w:r>
+        <w:rPr>
+          <w:rStyle w:val="VerbatimChar"/>
+        </w:rPr>
+        <w:t xml:space="preserve">User-facing global shortcut:</w:t>
+      </w:r>
+      <w:r>
+        <w:br/>
+      </w:r>
+      <w:r>
+        <w:rPr>
+          <w:rStyle w:val="VerbatimChar"/>
+        </w:rPr>
+        <w:t xml:space="preserve">@games/lasca</w:t>
+      </w:r>
+      <w:r>
+        <w:br/>
+      </w:r>
+      <w:r>
+        <w:br/>
+      </w:r>
+      <w:r>
+        <w:rPr>
+          <w:rStyle w:val="VerbatimChar"/>
+        </w:rPr>
+        <w:t xml:space="preserve">        ↓  (global shortcut registry)</w:t>
+      </w:r>
+      <w:r>
+        <w:br/>
+      </w:r>
+      <w:r>
+        <w:br/>
+      </w:r>
+      <w:r>
+        <w:rPr>
+          <w:rStyle w:val="VerbatimChar"/>
+        </w:rPr>
+        <w:t xml:space="preserve">@games.strategy.abstract.capture.leaping.stacking.lasca</w:t>
+      </w:r>
+      <w:r>
+        <w:br/>
+      </w:r>
+      <w:r>
+        <w:br/>
+      </w:r>
+      <w:r>
+        <w:rPr>
+          <w:rStyle w:val="VerbatimChar"/>
+        </w:rPr>
+        <w:t xml:space="preserve">        ↓  (discovery finds verified owner records)</w:t>
+      </w:r>
+      <w:r>
+        <w:br/>
+      </w:r>
+      <w:r>
+        <w:br/>
+      </w:r>
+      <w:r>
+        <w:rPr>
+          <w:rStyle w:val="VerbatimChar"/>
+        </w:rPr>
+        <w:t xml:space="preserve">@stackworks/lasca</w:t>
+      </w:r>
+      <w:r>
+        <w:br/>
+      </w:r>
+      <w:r>
+        <w:rPr>
+          <w:rStyle w:val="VerbatimChar"/>
+        </w:rPr>
+        <w:t xml:space="preserve">        ↓</w:t>
+      </w:r>
+      <w:r>
+        <w:br/>
+      </w:r>
+      <w:r>
+        <w:rPr>
+          <w:rStyle w:val="VerbatimChar"/>
+        </w:rPr>
+        <w:t xml:space="preserve">@owner/edbecnel/stackworks/games/strategy/abstract/capture/leaping/stacking/lasca</w:t>
+      </w:r>
+    </w:p>
+    <w:p>
+      <w:pPr>
+        <w:pStyle w:val="FirstParagraph"/>
+      </w:pPr>
+      <w:r>
+        <w:t xml:space="preserve">A domain bridge may also enter the chain:</w:t>
+      </w:r>
+    </w:p>
+    <w:p>
+      <w:pPr>
+        <w:pStyle w:val="SourceCode"/>
+      </w:pPr>
+      <w:r>
+        <w:rPr>
+          <w:rStyle w:val="VerbatimChar"/>
+        </w:rPr>
+        <w:t xml:space="preserve">lasca.stackworks.games</w:t>
+      </w:r>
+      <w:r>
+        <w:br/>
+      </w:r>
+      <w:r>
+        <w:rPr>
+          <w:rStyle w:val="VerbatimChar"/>
+        </w:rPr>
+        <w:t xml:space="preserve">        ↓  (domain manifest)</w:t>
+      </w:r>
+      <w:r>
+        <w:br/>
+      </w:r>
+      <w:r>
+        <w:br/>
+      </w:r>
+      <w:r>
+        <w:rPr>
+          <w:rStyle w:val="VerbatimChar"/>
+        </w:rPr>
+        <w:t xml:space="preserve">@stackworks/lasca</w:t>
+      </w:r>
+      <w:r>
+        <w:br/>
+      </w:r>
+      <w:r>
+        <w:rPr>
+          <w:rStyle w:val="VerbatimChar"/>
+        </w:rPr>
+        <w:t xml:space="preserve">        ↓</w:t>
+      </w:r>
+      <w:r>
+        <w:br/>
+      </w:r>
+      <w:r>
+        <w:br/>
+      </w:r>
+      <w:r>
+        <w:rPr>
+          <w:rStyle w:val="VerbatimChar"/>
+        </w:rPr>
+        <w:t xml:space="preserve">@owner/edbecnel/stackworks/games/strategy/abstract/capture/leaping/stacking/lasca</w:t>
+      </w:r>
+    </w:p>
+    <w:p>
+      <w:pPr>
+        <w:pStyle w:val="FirstParagraph"/>
+      </w:pPr>
+      <w:r>
+        <w:t xml:space="preserve">The layered model in summary:</w:t>
+      </w:r>
+    </w:p>
+    <w:p>
+      <w:pPr>
+        <w:pStyle w:val="SourceCode"/>
+      </w:pPr>
+      <w:r>
+        <w:rPr>
+          <w:rStyle w:val="VerbatimChar"/>
+        </w:rPr>
+        <w:t xml:space="preserve">Domain alias</w:t>
+      </w:r>
+      <w:r>
+        <w:br/>
+      </w:r>
+      <w:r>
+        <w:rPr>
+          <w:rStyle w:val="VerbatimChar"/>
+        </w:rPr>
+        <w:t xml:space="preserve">        ↓</w:t>
+      </w:r>
+      <w:r>
+        <w:br/>
+      </w:r>
+      <w:r>
+        <w:rPr>
+          <w:rStyle w:val="VerbatimChar"/>
+        </w:rPr>
+        <w:t xml:space="preserve">SIP shortcut string</w:t>
+      </w:r>
+      <w:r>
+        <w:br/>
+      </w:r>
+      <w:r>
+        <w:rPr>
+          <w:rStyle w:val="VerbatimChar"/>
+        </w:rPr>
+        <w:t xml:space="preserve">        ↓</w:t>
+      </w:r>
+      <w:r>
+        <w:br/>
+      </w:r>
+      <w:r>
+        <w:rPr>
+          <w:rStyle w:val="VerbatimChar"/>
+        </w:rPr>
+        <w:t xml:space="preserve">Semantic discovery path</w:t>
+      </w:r>
+      <w:r>
+        <w:br/>
+      </w:r>
+      <w:r>
+        <w:rPr>
+          <w:rStyle w:val="VerbatimChar"/>
+        </w:rPr>
+        <w:t xml:space="preserve">        ↓</w:t>
+      </w:r>
+      <w:r>
+        <w:br/>
+      </w:r>
+      <w:r>
+        <w:rPr>
+          <w:rStyle w:val="VerbatimChar"/>
+        </w:rPr>
+        <w:t xml:space="preserve">Owner-bound canonical SIP identity</w:t>
+      </w:r>
+    </w:p>
+    <w:p>
+      <w:r>
+        <w:pict>
+          <v:rect style="width:0;height:1.5pt" o:hralign="center" o:hrstd="t" o:hr="t"/>
+        </w:pict>
+      </w:r>
+    </w:p>
+    <w:bookmarkEnd w:id="248"/>
+    <w:bookmarkStart w:id="249" w:name="core-rules"/>
+    <w:p>
+      <w:pPr>
+        <w:pStyle w:val="Heading2"/>
+      </w:pPr>
+      <w:r>
+        <w:t xml:space="preserve">Core Rules</w:t>
+      </w:r>
+    </w:p>
+    <w:p>
+      <w:pPr>
+        <w:pStyle w:val="SourceCode"/>
+      </w:pPr>
+      <w:r>
+        <w:rPr>
+          <w:rStyle w:val="VerbatimChar"/>
+        </w:rPr>
+        <w:t xml:space="preserve">1. SIP strings begin with @.</w:t>
+      </w:r>
+      <w:r>
+        <w:br/>
+      </w:r>
+      <w:r>
+        <w:rPr>
+          <w:rStyle w:val="VerbatimChar"/>
+        </w:rPr>
+        <w:t xml:space="preserve">2. Domain aliases do not begin with @ and are not SIP strings.</w:t>
+      </w:r>
+      <w:r>
+        <w:br/>
+      </w:r>
+      <w:r>
+        <w:rPr>
+          <w:rStyle w:val="VerbatimChar"/>
+        </w:rPr>
+        <w:t xml:space="preserve">3. Global semantic shortcuts resolve to discovery paths, not directly to private owners.</w:t>
+      </w:r>
+      <w:r>
+        <w:br/>
+      </w:r>
+      <w:r>
+        <w:rPr>
+          <w:rStyle w:val="VerbatimChar"/>
+        </w:rPr>
+        <w:t xml:space="preserve">4. Owner or brand shortcuts resolve to owner-bound records.</w:t>
+      </w:r>
+      <w:r>
+        <w:br/>
+      </w:r>
+      <w:r>
+        <w:rPr>
+          <w:rStyle w:val="VerbatimChar"/>
+        </w:rPr>
+        <w:t xml:space="preserve">5. Global shortcuts must be accepted through a registry or namespace steward process.</w:t>
+      </w:r>
+      <w:r>
+        <w:br/>
+      </w:r>
+      <w:r>
+        <w:rPr>
+          <w:rStyle w:val="VerbatimChar"/>
+        </w:rPr>
+        <w:t xml:space="preserve">6. First use should not automatically win for public semantic concepts.</w:t>
+      </w:r>
+      <w:r>
+        <w:br/>
+      </w:r>
+      <w:r>
+        <w:rPr>
+          <w:rStyle w:val="VerbatimChar"/>
+        </w:rPr>
+        <w:t xml:space="preserve">7. Shortcut records should be signed, public, versioned, and auditable.</w:t>
+      </w:r>
+    </w:p>
+    <w:p>
+      <w:pPr>
+        <w:pStyle w:val="FirstParagraph"/>
+      </w:pPr>
+      <w:r>
+        <w:t xml:space="preserve">This makes SIP practical for humans while preserving the deeper semantic and ownership guarantees that make SIP valuable for AI-native identity resolution.</w:t>
+      </w:r>
+    </w:p>
+    <w:p>
+      <w:r>
+        <w:pict>
+          <v:rect style="width:0;height:1.5pt" o:hralign="center" o:hrstd="t" o:hr="t"/>
+        </w:pict>
+      </w:r>
+    </w:p>
+    <w:bookmarkEnd w:id="249"/>
+    <w:bookmarkEnd w:id="250"/>
     <w:sectPr>
       <w:footnotePr>
         <w:numRestart w:val="eachSect"/>
@@ -25015,6 +28320,39 @@
     <w:abstractNumId w:val="991"/>
   </w:num>
   <w:num w:numId="1150">
+    <w:abstractNumId w:val="991"/>
+  </w:num>
+  <w:num w:numId="1151">
+    <w:abstractNumId w:val="99411"/>
+    <w:lvlOverride w:ilvl="0">
+      <w:startOverride w:val="1"/>
+    </w:lvlOverride>
+    <w:lvlOverride w:ilvl="1">
+      <w:startOverride w:val="1"/>
+    </w:lvlOverride>
+    <w:lvlOverride w:ilvl="2">
+      <w:startOverride w:val="1"/>
+    </w:lvlOverride>
+    <w:lvlOverride w:ilvl="3">
+      <w:startOverride w:val="1"/>
+    </w:lvlOverride>
+    <w:lvlOverride w:ilvl="4">
+      <w:startOverride w:val="1"/>
+    </w:lvlOverride>
+    <w:lvlOverride w:ilvl="5">
+      <w:startOverride w:val="1"/>
+    </w:lvlOverride>
+    <w:lvlOverride w:ilvl="6">
+      <w:startOverride w:val="1"/>
+    </w:lvlOverride>
+    <w:lvlOverride w:ilvl="7">
+      <w:startOverride w:val="1"/>
+    </w:lvlOverride>
+    <w:lvlOverride w:ilvl="8">
+      <w:startOverride w:val="1"/>
+    </w:lvlOverride>
+  </w:num>
+  <w:num w:numId="1152">
     <w:abstractNumId w:val="991"/>
   </w:num>
 </w:numbering>

</xml_diff>